<commit_message>
Restyle HW2 figures and Word report; fix swapped Q1 figure files
Co-Authored-By: Claude Opus 5.5 <noreply@anthropic.com>
Claude-Session: https://claude.ai/code/session_015xCXyYN8m36HffbEQaovsv
</commit_message>
<xml_diff>
--- a/hw2/HW2_Report.docx
+++ b/hw2/HW2_Report.docx
@@ -6,6 +6,7 @@
     <w:p>
       <w:pPr>
         <w:pStyle w:val="Heading1"/>
+        <w:jc w:val="center"/>
       </w:pPr>
       <w:r>
         <w:t xml:space="preserve">OPIM 348 — Homework 2 Report</w:t>
@@ -132,6 +133,9 @@
     <w:p>
       <w:pPr>
         <w:pStyle w:val="Heading2"/>
+        <w:pBdr>
+          <w:bottom w:val="single" w:sz="8" w:space="2" w:color="7C3AED"/>
+        </w:pBdr>
       </w:pPr>
       <w:r>
         <w:t xml:space="preserve">Question 1 — Operating room booking</w:t>
@@ -190,6 +194,7 @@
     <w:p>
       <w:pPr>
         <w:pStyle w:val="CaptionedFigure"/>
+        <w:jc w:val="center"/>
       </w:pPr>
       <w:r>
         <w:drawing>
@@ -237,6 +242,7 @@
     <w:p>
       <w:pPr>
         <w:pStyle w:val="ImageCaption"/>
+        <w:jc w:val="center"/>
       </w:pPr>
       <w:r>
         <w:t xml:space="preserve">Figure 1. Actual occupancy vs booked time, with 45° line</w:t>
@@ -374,12 +380,12 @@
         <w:tblLayout w:type="fixed"/>
         <w:tblLook w:firstRow="1" w:lastRow="0" w:firstColumn="0" w:lastColumn="0" w:noHBand="0" w:noVBand="0" w:val="0020"/>
         <w:tblBorders>
-          <w:top w:val="single" w:sz="4" w:color="999999"/>
-          <w:left w:val="single" w:sz="4" w:color="999999"/>
-          <w:bottom w:val="single" w:sz="4" w:color="999999"/>
-          <w:right w:val="single" w:sz="4" w:color="999999"/>
-          <w:insideH w:val="single" w:sz="4" w:color="999999"/>
-          <w:insideV w:val="single" w:sz="4" w:color="999999"/>
+          <w:top w:val="single" w:sz="12" w:color="0D9488"/>
+          <w:bottom w:val="single" w:sz="12" w:color="0D9488"/>
+          <w:insideH w:val="dotted" w:sz="4" w:color="94A3B8"/>
+          <w:left w:val="nil" w:sz="0" w:color="auto"/>
+          <w:right w:val="nil" w:sz="0" w:color="auto"/>
+          <w:insideV w:val="nil" w:sz="0" w:color="auto"/>
         </w:tblBorders>
       </w:tblPr>
       <w:tblGrid>
@@ -394,74 +400,99 @@
           <w:tblHeader w:val="on"/>
         </w:trPr>
         <w:tc>
-          <w:tcPr/>
-          <w:p>
-            <w:pPr>
-              <w:pStyle w:val="Compact"/>
-            </w:pPr>
-            <w:r>
-              <w:rPr>
+          <w:tcPr>
+            <w:shd w:val="clear" w:color="auto" w:fill="0D9488"/>
+          </w:tcPr>
+          <w:p>
+            <w:pPr>
+              <w:pStyle w:val="Compact"/>
+            </w:pPr>
+            <w:r>
+              <w:rPr>
+                <w:rFonts w:ascii="Trebuchet MS" w:hAnsi="Trebuchet MS"/>
                 <w:b/>
+                <w:color w:val="FFFFFF"/>
+                <w:sz w:val="19"/>
               </w:rPr>
               <w:t xml:space="preserve">Policy (test set, n = 435)</w:t>
             </w:r>
           </w:p>
         </w:tc>
         <w:tc>
-          <w:tcPr/>
-          <w:p>
-            <w:pPr>
-              <w:pStyle w:val="Compact"/>
-              <w:jc w:val="right"/>
-            </w:pPr>
-            <w:r>
-              <w:rPr>
+          <w:tcPr>
+            <w:shd w:val="clear" w:color="auto" w:fill="0D9488"/>
+          </w:tcPr>
+          <w:p>
+            <w:pPr>
+              <w:pStyle w:val="Compact"/>
+              <w:jc w:val="right"/>
+            </w:pPr>
+            <w:r>
+              <w:rPr>
+                <w:rFonts w:ascii="Trebuchet MS" w:hAnsi="Trebuchet MS"/>
                 <w:b/>
+                <w:color w:val="FFFFFF"/>
+                <w:sz w:val="19"/>
               </w:rPr>
               <w:t xml:space="preserve">Total cost</w:t>
             </w:r>
           </w:p>
         </w:tc>
         <w:tc>
-          <w:tcPr/>
-          <w:p>
-            <w:pPr>
-              <w:pStyle w:val="Compact"/>
-              <w:jc w:val="right"/>
-            </w:pPr>
-            <w:r>
-              <w:rPr>
+          <w:tcPr>
+            <w:shd w:val="clear" w:color="auto" w:fill="0D9488"/>
+          </w:tcPr>
+          <w:p>
+            <w:pPr>
+              <w:pStyle w:val="Compact"/>
+              <w:jc w:val="right"/>
+            </w:pPr>
+            <w:r>
+              <w:rPr>
+                <w:rFonts w:ascii="Trebuchet MS" w:hAnsi="Trebuchet MS"/>
                 <w:b/>
+                <w:color w:val="FFFFFF"/>
+                <w:sz w:val="19"/>
               </w:rPr>
               <w:t xml:space="preserve">Unused min</w:t>
             </w:r>
           </w:p>
         </w:tc>
         <w:tc>
-          <w:tcPr/>
-          <w:p>
-            <w:pPr>
-              <w:pStyle w:val="Compact"/>
-              <w:jc w:val="right"/>
-            </w:pPr>
-            <w:r>
-              <w:rPr>
+          <w:tcPr>
+            <w:shd w:val="clear" w:color="auto" w:fill="0D9488"/>
+          </w:tcPr>
+          <w:p>
+            <w:pPr>
+              <w:pStyle w:val="Compact"/>
+              <w:jc w:val="right"/>
+            </w:pPr>
+            <w:r>
+              <w:rPr>
+                <w:rFonts w:ascii="Trebuchet MS" w:hAnsi="Trebuchet MS"/>
                 <w:b/>
+                <w:color w:val="FFFFFF"/>
+                <w:sz w:val="19"/>
               </w:rPr>
               <w:t xml:space="preserve">Overrun min</w:t>
             </w:r>
           </w:p>
         </w:tc>
         <w:tc>
-          <w:tcPr/>
-          <w:p>
-            <w:pPr>
-              <w:pStyle w:val="Compact"/>
-              <w:jc w:val="right"/>
-            </w:pPr>
-            <w:r>
-              <w:rPr>
+          <w:tcPr>
+            <w:shd w:val="clear" w:color="auto" w:fill="0D9488"/>
+          </w:tcPr>
+          <w:p>
+            <w:pPr>
+              <w:pStyle w:val="Compact"/>
+              <w:jc w:val="right"/>
+            </w:pPr>
+            <w:r>
+              <w:rPr>
+                <w:rFonts w:ascii="Trebuchet MS" w:hAnsi="Trebuchet MS"/>
                 <w:b/>
+                <w:color w:val="FFFFFF"/>
+                <w:sz w:val="19"/>
               </w:rPr>
               <w:t xml:space="preserve">% overrun</w:t>
             </w:r>
@@ -476,6 +507,10 @@
               <w:pStyle w:val="Compact"/>
             </w:pPr>
             <w:r>
+              <w:rPr>
+                <w:rFonts w:ascii="Trebuchet MS" w:hAnsi="Trebuchet MS"/>
+                <w:sz w:val="19"/>
+              </w:rPr>
               <w:t xml:space="preserve">Historical booking</w:t>
             </w:r>
           </w:p>
@@ -488,6 +523,10 @@
               <w:jc w:val="right"/>
             </w:pPr>
             <w:r>
+              <w:rPr>
+                <w:rFonts w:ascii="Trebuchet MS" w:hAnsi="Trebuchet MS"/>
+                <w:sz w:val="19"/>
+              </w:rPr>
               <w:t xml:space="preserve">$336,400</w:t>
             </w:r>
           </w:p>
@@ -500,6 +539,10 @@
               <w:jc w:val="right"/>
             </w:pPr>
             <w:r>
+              <w:rPr>
+                <w:rFonts w:ascii="Trebuchet MS" w:hAnsi="Trebuchet MS"/>
+                <w:sz w:val="19"/>
+              </w:rPr>
               <w:t xml:space="preserve">1,755</w:t>
             </w:r>
           </w:p>
@@ -512,6 +555,10 @@
               <w:jc w:val="right"/>
             </w:pPr>
             <w:r>
+              <w:rPr>
+                <w:rFonts w:ascii="Trebuchet MS" w:hAnsi="Trebuchet MS"/>
+                <w:sz w:val="19"/>
+              </w:rPr>
               <w:t xml:space="preserve">3,218</w:t>
             </w:r>
           </w:p>
@@ -524,6 +571,10 @@
               <w:jc w:val="right"/>
             </w:pPr>
             <w:r>
+              <w:rPr>
+                <w:rFonts w:ascii="Trebuchet MS" w:hAnsi="Trebuchet MS"/>
+                <w:sz w:val="19"/>
+              </w:rPr>
               <w:t xml:space="preserve">61.4%</w:t>
             </w:r>
           </w:p>
@@ -531,60 +582,90 @@
       </w:tr>
       <w:tr>
         <w:tc>
-          <w:tcPr/>
-          <w:p>
-            <w:pPr>
-              <w:pStyle w:val="Compact"/>
-            </w:pPr>
-            <w:r>
+          <w:tcPr>
+            <w:shd w:val="clear" w:color="auto" w:fill="F1F5F4"/>
+          </w:tcPr>
+          <w:p>
+            <w:pPr>
+              <w:pStyle w:val="Compact"/>
+            </w:pPr>
+            <w:r>
+              <w:rPr>
+                <w:rFonts w:ascii="Trebuchet MS" w:hAnsi="Trebuchet MS"/>
+                <w:sz w:val="19"/>
+              </w:rPr>
               <w:t xml:space="preserve">Predicted mean</w:t>
             </w:r>
           </w:p>
         </w:tc>
         <w:tc>
-          <w:tcPr/>
-          <w:p>
-            <w:pPr>
-              <w:pStyle w:val="Compact"/>
-              <w:jc w:val="right"/>
-            </w:pPr>
-            <w:r>
+          <w:tcPr>
+            <w:shd w:val="clear" w:color="auto" w:fill="F1F5F4"/>
+          </w:tcPr>
+          <w:p>
+            <w:pPr>
+              <w:pStyle w:val="Compact"/>
+              <w:jc w:val="right"/>
+            </w:pPr>
+            <w:r>
+              <w:rPr>
+                <w:rFonts w:ascii="Trebuchet MS" w:hAnsi="Trebuchet MS"/>
+                <w:sz w:val="19"/>
+              </w:rPr>
               <w:t xml:space="preserve">$149,650</w:t>
             </w:r>
           </w:p>
         </w:tc>
         <w:tc>
-          <w:tcPr/>
-          <w:p>
-            <w:pPr>
-              <w:pStyle w:val="Compact"/>
-              <w:jc w:val="right"/>
-            </w:pPr>
-            <w:r>
+          <w:tcPr>
+            <w:shd w:val="clear" w:color="auto" w:fill="F1F5F4"/>
+          </w:tcPr>
+          <w:p>
+            <w:pPr>
+              <w:pStyle w:val="Compact"/>
+              <w:jc w:val="right"/>
+            </w:pPr>
+            <w:r>
+              <w:rPr>
+                <w:rFonts w:ascii="Trebuchet MS" w:hAnsi="Trebuchet MS"/>
+                <w:sz w:val="19"/>
+              </w:rPr>
               <w:t xml:space="preserve">873</w:t>
             </w:r>
           </w:p>
         </w:tc>
         <w:tc>
-          <w:tcPr/>
-          <w:p>
-            <w:pPr>
-              <w:pStyle w:val="Compact"/>
-              <w:jc w:val="right"/>
-            </w:pPr>
-            <w:r>
+          <w:tcPr>
+            <w:shd w:val="clear" w:color="auto" w:fill="F1F5F4"/>
+          </w:tcPr>
+          <w:p>
+            <w:pPr>
+              <w:pStyle w:val="Compact"/>
+              <w:jc w:val="right"/>
+            </w:pPr>
+            <w:r>
+              <w:rPr>
+                <w:rFonts w:ascii="Trebuchet MS" w:hAnsi="Trebuchet MS"/>
+                <w:sz w:val="19"/>
+              </w:rPr>
               <w:t xml:space="preserve">1,247</w:t>
             </w:r>
           </w:p>
         </w:tc>
         <w:tc>
-          <w:tcPr/>
-          <w:p>
-            <w:pPr>
-              <w:pStyle w:val="Compact"/>
-              <w:jc w:val="right"/>
-            </w:pPr>
-            <w:r>
+          <w:tcPr>
+            <w:shd w:val="clear" w:color="auto" w:fill="F1F5F4"/>
+          </w:tcPr>
+          <w:p>
+            <w:pPr>
+              <w:pStyle w:val="Compact"/>
+              <w:jc w:val="right"/>
+            </w:pPr>
+            <w:r>
+              <w:rPr>
+                <w:rFonts w:ascii="Trebuchet MS" w:hAnsi="Trebuchet MS"/>
+                <w:sz w:val="19"/>
+              </w:rPr>
               <w:t xml:space="preserve">42.8%</w:t>
             </w:r>
           </w:p>
@@ -598,6 +679,10 @@
               <w:pStyle w:val="Compact"/>
             </w:pPr>
             <w:r>
+              <w:rPr>
+                <w:rFonts w:ascii="Trebuchet MS" w:hAnsi="Trebuchet MS"/>
+                <w:sz w:val="19"/>
+              </w:rPr>
               <w:t xml:space="preserve">Cost-based, Normal (required)</w:t>
             </w:r>
           </w:p>
@@ -610,6 +695,10 @@
               <w:jc w:val="right"/>
             </w:pPr>
             <w:r>
+              <w:rPr>
+                <w:rFonts w:ascii="Trebuchet MS" w:hAnsi="Trebuchet MS"/>
+                <w:sz w:val="19"/>
+              </w:rPr>
               <w:t xml:space="preserve">$149,700</w:t>
             </w:r>
           </w:p>
@@ -622,6 +711,10 @@
               <w:jc w:val="right"/>
             </w:pPr>
             <w:r>
+              <w:rPr>
+                <w:rFonts w:ascii="Trebuchet MS" w:hAnsi="Trebuchet MS"/>
+                <w:sz w:val="19"/>
+              </w:rPr>
               <w:t xml:space="preserve">421</w:t>
             </w:r>
           </w:p>
@@ -634,6 +727,10 @@
               <w:jc w:val="right"/>
             </w:pPr>
             <w:r>
+              <w:rPr>
+                <w:rFonts w:ascii="Trebuchet MS" w:hAnsi="Trebuchet MS"/>
+                <w:sz w:val="19"/>
+              </w:rPr>
               <w:t xml:space="preserve">2,152</w:t>
             </w:r>
           </w:p>
@@ -646,6 +743,10 @@
               <w:jc w:val="right"/>
             </w:pPr>
             <w:r>
+              <w:rPr>
+                <w:rFonts w:ascii="Trebuchet MS" w:hAnsi="Trebuchet MS"/>
+                <w:sz w:val="19"/>
+              </w:rPr>
               <w:t xml:space="preserve">79.1%</w:t>
             </w:r>
           </w:p>
@@ -653,79 +754,99 @@
       </w:tr>
       <w:tr>
         <w:tc>
-          <w:tcPr/>
-          <w:p>
-            <w:pPr>
-              <w:pStyle w:val="Compact"/>
-            </w:pPr>
-            <w:r>
-              <w:rPr>
+          <w:tcPr>
+            <w:shd w:val="clear" w:color="auto" w:fill="F1F5F4"/>
+          </w:tcPr>
+          <w:p>
+            <w:pPr>
+              <w:pStyle w:val="Compact"/>
+            </w:pPr>
+            <w:r>
+              <w:rPr>
+                <w:rFonts w:ascii="Trebuchet MS" w:hAnsi="Trebuchet MS"/>
                 <w:i/>
                 <w:iCs/>
+                <w:sz w:val="19"/>
               </w:rPr>
               <w:t xml:space="preserve">Sensitivity: empirical 1/3 quantile of training residuals</w:t>
             </w:r>
           </w:p>
         </w:tc>
         <w:tc>
-          <w:tcPr/>
-          <w:p>
-            <w:pPr>
-              <w:pStyle w:val="Compact"/>
-              <w:jc w:val="right"/>
-            </w:pPr>
-            <w:r>
-              <w:rPr>
+          <w:tcPr>
+            <w:shd w:val="clear" w:color="auto" w:fill="F1F5F4"/>
+          </w:tcPr>
+          <w:p>
+            <w:pPr>
+              <w:pStyle w:val="Compact"/>
+              <w:jc w:val="right"/>
+            </w:pPr>
+            <w:r>
+              <w:rPr>
+                <w:rFonts w:ascii="Trebuchet MS" w:hAnsi="Trebuchet MS"/>
                 <w:i/>
                 <w:iCs/>
+                <w:sz w:val="19"/>
               </w:rPr>
               <w:t xml:space="preserve">$140,300</w:t>
             </w:r>
           </w:p>
         </w:tc>
         <w:tc>
-          <w:tcPr/>
-          <w:p>
-            <w:pPr>
-              <w:pStyle w:val="Compact"/>
-              <w:jc w:val="right"/>
-            </w:pPr>
-            <w:r>
-              <w:rPr>
+          <w:tcPr>
+            <w:shd w:val="clear" w:color="auto" w:fill="F1F5F4"/>
+          </w:tcPr>
+          <w:p>
+            <w:pPr>
+              <w:pStyle w:val="Compact"/>
+              <w:jc w:val="right"/>
+            </w:pPr>
+            <w:r>
+              <w:rPr>
+                <w:rFonts w:ascii="Trebuchet MS" w:hAnsi="Trebuchet MS"/>
                 <w:i/>
                 <w:iCs/>
+                <w:sz w:val="19"/>
               </w:rPr>
               <w:t xml:space="preserve">522</w:t>
             </w:r>
           </w:p>
         </w:tc>
         <w:tc>
-          <w:tcPr/>
-          <w:p>
-            <w:pPr>
-              <w:pStyle w:val="Compact"/>
-              <w:jc w:val="right"/>
-            </w:pPr>
-            <w:r>
-              <w:rPr>
+          <w:tcPr>
+            <w:shd w:val="clear" w:color="auto" w:fill="F1F5F4"/>
+          </w:tcPr>
+          <w:p>
+            <w:pPr>
+              <w:pStyle w:val="Compact"/>
+              <w:jc w:val="right"/>
+            </w:pPr>
+            <w:r>
+              <w:rPr>
+                <w:rFonts w:ascii="Trebuchet MS" w:hAnsi="Trebuchet MS"/>
                 <w:i/>
                 <w:iCs/>
+                <w:sz w:val="19"/>
               </w:rPr>
               <w:t xml:space="preserve">1,762</w:t>
             </w:r>
           </w:p>
         </w:tc>
         <w:tc>
-          <w:tcPr/>
-          <w:p>
-            <w:pPr>
-              <w:pStyle w:val="Compact"/>
-              <w:jc w:val="right"/>
-            </w:pPr>
-            <w:r>
-              <w:rPr>
+          <w:tcPr>
+            <w:shd w:val="clear" w:color="auto" w:fill="F1F5F4"/>
+          </w:tcPr>
+          <w:p>
+            <w:pPr>
+              <w:pStyle w:val="Compact"/>
+              <w:jc w:val="right"/>
+            </w:pPr>
+            <w:r>
+              <w:rPr>
+                <w:rFonts w:ascii="Trebuchet MS" w:hAnsi="Trebuchet MS"/>
                 <w:i/>
                 <w:iCs/>
+                <w:sz w:val="19"/>
               </w:rPr>
               <w:t xml:space="preserve">64.1%</w:t>
             </w:r>
@@ -744,11 +865,12 @@
     <w:p>
       <w:pPr>
         <w:pStyle w:val="CaptionedFigure"/>
+        <w:jc w:val="center"/>
       </w:pPr>
       <w:r>
         <w:drawing>
           <wp:inline>
-            <wp:extent cx="4389120" cy="1955392"/>
+            <wp:extent cx="4389120" cy="1695689"/>
             <wp:effectExtent b="0" l="0" r="0" t="0"/>
             <wp:docPr descr="Figure 2. Test mismatch cost by booking policy" title="" id="13" name="Picture"/>
             <a:graphic>
@@ -769,7 +891,7 @@
                   <pic:spPr bwMode="auto">
                     <a:xfrm>
                       <a:off x="0" y="0"/>
-                      <a:ext cx="4389120" cy="1955392"/>
+                      <a:ext cx="4389120" cy="1695689"/>
                     </a:xfrm>
                     <a:prstGeom prst="rect">
                       <a:avLst/>
@@ -791,6 +913,7 @@
     <w:p>
       <w:pPr>
         <w:pStyle w:val="ImageCaption"/>
+        <w:jc w:val="center"/>
       </w:pPr>
       <w:r>
         <w:t xml:space="preserve">Figure 2. Test mismatch cost by booking policy</w:t>
@@ -799,11 +922,12 @@
     <w:p>
       <w:pPr>
         <w:pStyle w:val="CaptionedFigure"/>
+        <w:jc w:val="center"/>
       </w:pPr>
       <w:r>
         <w:drawing>
           <wp:inline>
-            <wp:extent cx="4389120" cy="2296836"/>
+            <wp:extent cx="4389120" cy="2211484"/>
             <wp:effectExtent b="0" l="0" r="0" t="0"/>
             <wp:docPr descr="Figure 3. Training residuals vs Normal approximation" title="" id="16" name="Picture"/>
             <a:graphic>
@@ -824,7 +948,7 @@
                   <pic:spPr bwMode="auto">
                     <a:xfrm>
                       <a:off x="0" y="0"/>
-                      <a:ext cx="4389120" cy="2296836"/>
+                      <a:ext cx="4389120" cy="2211484"/>
                     </a:xfrm>
                     <a:prstGeom prst="rect">
                       <a:avLst/>
@@ -846,6 +970,7 @@
     <w:p>
       <w:pPr>
         <w:pStyle w:val="ImageCaption"/>
+        <w:jc w:val="center"/>
       </w:pPr>
       <w:r>
         <w:t xml:space="preserve">Figure 3. Training residuals vs Normal approximation</w:t>
@@ -874,6 +999,9 @@
     <w:p>
       <w:pPr>
         <w:pStyle w:val="Heading2"/>
+        <w:pBdr>
+          <w:bottom w:val="single" w:sz="8" w:space="2" w:color="7C3AED"/>
+        </w:pBdr>
       </w:pPr>
       <w:r>
         <w:t xml:space="preserve">Question 2 — Two-day sales forecasting</w:t>
@@ -937,6 +1065,7 @@
     <w:p>
       <w:pPr>
         <w:pStyle w:val="CaptionedFigure"/>
+        <w:jc w:val="center"/>
       </w:pPr>
       <w:r>
         <w:drawing>
@@ -984,6 +1113,7 @@
     <w:p>
       <w:pPr>
         <w:pStyle w:val="ImageCaption"/>
+        <w:jc w:val="center"/>
       </w:pPr>
       <w:r>
         <w:t xml:space="preserve">Figure 4. Daily sales with training / validation / test blocks</w:t>
@@ -992,11 +1122,12 @@
     <w:p>
       <w:pPr>
         <w:pStyle w:val="CaptionedFigure"/>
+        <w:jc w:val="center"/>
       </w:pPr>
       <w:r>
         <w:drawing>
           <wp:inline>
-            <wp:extent cx="4389120" cy="2098447"/>
+            <wp:extent cx="4389120" cy="2182501"/>
             <wp:effectExtent b="0" l="0" r="0" t="0"/>
             <wp:docPr descr="Figure 5. Mean daily sales by weekday" title="" id="23" name="Picture"/>
             <a:graphic>
@@ -1017,7 +1148,7 @@
                   <pic:spPr bwMode="auto">
                     <a:xfrm>
                       <a:off x="0" y="0"/>
-                      <a:ext cx="4389120" cy="2098447"/>
+                      <a:ext cx="4389120" cy="2182501"/>
                     </a:xfrm>
                     <a:prstGeom prst="rect">
                       <a:avLst/>
@@ -1039,6 +1170,7 @@
     <w:p>
       <w:pPr>
         <w:pStyle w:val="ImageCaption"/>
+        <w:jc w:val="center"/>
       </w:pPr>
       <w:r>
         <w:t xml:space="preserve">Figure 5. Mean daily sales by weekday</w:t>
@@ -1069,12 +1201,12 @@
         <w:tblLayout w:type="fixed"/>
         <w:tblLook w:firstRow="1" w:lastRow="0" w:firstColumn="0" w:lastColumn="0" w:noHBand="0" w:noVBand="0" w:val="0020"/>
         <w:tblBorders>
-          <w:top w:val="single" w:sz="4" w:color="999999"/>
-          <w:left w:val="single" w:sz="4" w:color="999999"/>
-          <w:bottom w:val="single" w:sz="4" w:color="999999"/>
-          <w:right w:val="single" w:sz="4" w:color="999999"/>
-          <w:insideH w:val="single" w:sz="4" w:color="999999"/>
-          <w:insideV w:val="single" w:sz="4" w:color="999999"/>
+          <w:top w:val="single" w:sz="12" w:color="0D9488"/>
+          <w:bottom w:val="single" w:sz="12" w:color="0D9488"/>
+          <w:insideH w:val="dotted" w:sz="4" w:color="94A3B8"/>
+          <w:left w:val="nil" w:sz="0" w:color="auto"/>
+          <w:right w:val="nil" w:sz="0" w:color="auto"/>
+          <w:insideV w:val="nil" w:sz="0" w:color="auto"/>
         </w:tblBorders>
       </w:tblPr>
       <w:tblGrid>
@@ -1088,59 +1220,79 @@
           <w:tblHeader w:val="on"/>
         </w:trPr>
         <w:tc>
-          <w:tcPr/>
-          <w:p>
-            <w:pPr>
-              <w:pStyle w:val="Compact"/>
-            </w:pPr>
-            <w:r>
-              <w:rPr>
+          <w:tcPr>
+            <w:shd w:val="clear" w:color="auto" w:fill="0D9488"/>
+          </w:tcPr>
+          <w:p>
+            <w:pPr>
+              <w:pStyle w:val="Compact"/>
+            </w:pPr>
+            <w:r>
+              <w:rPr>
+                <w:rFonts w:ascii="Trebuchet MS" w:hAnsi="Trebuchet MS"/>
                 <w:b/>
+                <w:color w:val="FFFFFF"/>
+                <w:sz w:val="19"/>
               </w:rPr>
               <w:t xml:space="preserve">Model (validation, two-day totals)</w:t>
             </w:r>
           </w:p>
         </w:tc>
         <w:tc>
-          <w:tcPr/>
-          <w:p>
-            <w:pPr>
-              <w:pStyle w:val="Compact"/>
-              <w:jc w:val="right"/>
-            </w:pPr>
-            <w:r>
-              <w:rPr>
+          <w:tcPr>
+            <w:shd w:val="clear" w:color="auto" w:fill="0D9488"/>
+          </w:tcPr>
+          <w:p>
+            <w:pPr>
+              <w:pStyle w:val="Compact"/>
+              <w:jc w:val="right"/>
+            </w:pPr>
+            <w:r>
+              <w:rPr>
+                <w:rFonts w:ascii="Trebuchet MS" w:hAnsi="Trebuchet MS"/>
                 <w:b/>
+                <w:color w:val="FFFFFF"/>
+                <w:sz w:val="19"/>
               </w:rPr>
               <w:t xml:space="preserve">MAE</w:t>
             </w:r>
           </w:p>
         </w:tc>
         <w:tc>
-          <w:tcPr/>
-          <w:p>
-            <w:pPr>
-              <w:pStyle w:val="Compact"/>
-              <w:jc w:val="right"/>
-            </w:pPr>
-            <w:r>
-              <w:rPr>
+          <w:tcPr>
+            <w:shd w:val="clear" w:color="auto" w:fill="0D9488"/>
+          </w:tcPr>
+          <w:p>
+            <w:pPr>
+              <w:pStyle w:val="Compact"/>
+              <w:jc w:val="right"/>
+            </w:pPr>
+            <w:r>
+              <w:rPr>
+                <w:rFonts w:ascii="Trebuchet MS" w:hAnsi="Trebuchet MS"/>
                 <w:b/>
+                <w:color w:val="FFFFFF"/>
+                <w:sz w:val="19"/>
               </w:rPr>
               <w:t xml:space="preserve">RMSE</w:t>
             </w:r>
           </w:p>
         </w:tc>
         <w:tc>
-          <w:tcPr/>
-          <w:p>
-            <w:pPr>
-              <w:pStyle w:val="Compact"/>
-              <w:jc w:val="right"/>
-            </w:pPr>
-            <w:r>
-              <w:rPr>
+          <w:tcPr>
+            <w:shd w:val="clear" w:color="auto" w:fill="0D9488"/>
+          </w:tcPr>
+          <w:p>
+            <w:pPr>
+              <w:pStyle w:val="Compact"/>
+              <w:jc w:val="right"/>
+            </w:pPr>
+            <w:r>
+              <w:rPr>
+                <w:rFonts w:ascii="Trebuchet MS" w:hAnsi="Trebuchet MS"/>
                 <w:b/>
+                <w:color w:val="FFFFFF"/>
+                <w:sz w:val="19"/>
               </w:rPr>
               <w:t xml:space="preserve">Mean error (actual − pred)</w:t>
             </w:r>
@@ -1156,8 +1308,10 @@
             </w:pPr>
             <w:r>
               <w:rPr>
+                <w:rFonts w:ascii="Trebuchet MS" w:hAnsi="Trebuchet MS"/>
                 <w:b/>
                 <w:bCs/>
+                <w:sz w:val="19"/>
               </w:rPr>
               <w:t xml:space="preserve">MA7</w:t>
             </w:r>
@@ -1172,8 +1326,10 @@
             </w:pPr>
             <w:r>
               <w:rPr>
+                <w:rFonts w:ascii="Trebuchet MS" w:hAnsi="Trebuchet MS"/>
                 <w:b/>
                 <w:bCs/>
+                <w:sz w:val="19"/>
               </w:rPr>
               <w:t xml:space="preserve">4.92</w:t>
             </w:r>
@@ -1188,8 +1344,10 @@
             </w:pPr>
             <w:r>
               <w:rPr>
+                <w:rFonts w:ascii="Trebuchet MS" w:hAnsi="Trebuchet MS"/>
                 <w:b/>
                 <w:bCs/>
+                <w:sz w:val="19"/>
               </w:rPr>
               <w:t xml:space="preserve">6.57</w:t>
             </w:r>
@@ -1203,6 +1361,10 @@
               <w:jc w:val="right"/>
             </w:pPr>
             <w:r>
+              <w:rPr>
+                <w:rFonts w:ascii="Trebuchet MS" w:hAnsi="Trebuchet MS"/>
+                <w:sz w:val="19"/>
+              </w:rPr>
               <w:t xml:space="preserve">−0.14</w:t>
             </w:r>
           </w:p>
@@ -1210,48 +1372,72 @@
       </w:tr>
       <w:tr>
         <w:tc>
-          <w:tcPr/>
-          <w:p>
-            <w:pPr>
-              <w:pStyle w:val="Compact"/>
-            </w:pPr>
-            <w:r>
+          <w:tcPr>
+            <w:shd w:val="clear" w:color="auto" w:fill="F1F5F4"/>
+          </w:tcPr>
+          <w:p>
+            <w:pPr>
+              <w:pStyle w:val="Compact"/>
+            </w:pPr>
+            <w:r>
+              <w:rPr>
+                <w:rFonts w:ascii="Trebuchet MS" w:hAnsi="Trebuchet MS"/>
+                <w:sz w:val="19"/>
+              </w:rPr>
               <w:t xml:space="preserve">ETS additive seasonal (sp = 7), no trend</w:t>
             </w:r>
           </w:p>
         </w:tc>
         <w:tc>
-          <w:tcPr/>
-          <w:p>
-            <w:pPr>
-              <w:pStyle w:val="Compact"/>
-              <w:jc w:val="right"/>
-            </w:pPr>
-            <w:r>
+          <w:tcPr>
+            <w:shd w:val="clear" w:color="auto" w:fill="F1F5F4"/>
+          </w:tcPr>
+          <w:p>
+            <w:pPr>
+              <w:pStyle w:val="Compact"/>
+              <w:jc w:val="right"/>
+            </w:pPr>
+            <w:r>
+              <w:rPr>
+                <w:rFonts w:ascii="Trebuchet MS" w:hAnsi="Trebuchet MS"/>
+                <w:sz w:val="19"/>
+              </w:rPr>
               <w:t xml:space="preserve">9.83</w:t>
             </w:r>
           </w:p>
         </w:tc>
         <w:tc>
-          <w:tcPr/>
-          <w:p>
-            <w:pPr>
-              <w:pStyle w:val="Compact"/>
-              <w:jc w:val="right"/>
-            </w:pPr>
-            <w:r>
+          <w:tcPr>
+            <w:shd w:val="clear" w:color="auto" w:fill="F1F5F4"/>
+          </w:tcPr>
+          <w:p>
+            <w:pPr>
+              <w:pStyle w:val="Compact"/>
+              <w:jc w:val="right"/>
+            </w:pPr>
+            <w:r>
+              <w:rPr>
+                <w:rFonts w:ascii="Trebuchet MS" w:hAnsi="Trebuchet MS"/>
+                <w:sz w:val="19"/>
+              </w:rPr>
               <w:t xml:space="preserve">12.05</w:t>
             </w:r>
           </w:p>
         </w:tc>
         <w:tc>
-          <w:tcPr/>
-          <w:p>
-            <w:pPr>
-              <w:pStyle w:val="Compact"/>
-              <w:jc w:val="right"/>
-            </w:pPr>
-            <w:r>
+          <w:tcPr>
+            <w:shd w:val="clear" w:color="auto" w:fill="F1F5F4"/>
+          </w:tcPr>
+          <w:p>
+            <w:pPr>
+              <w:pStyle w:val="Compact"/>
+              <w:jc w:val="right"/>
+            </w:pPr>
+            <w:r>
+              <w:rPr>
+                <w:rFonts w:ascii="Trebuchet MS" w:hAnsi="Trebuchet MS"/>
+                <w:sz w:val="19"/>
+              </w:rPr>
               <w:t xml:space="preserve">−0.10</w:t>
             </w:r>
           </w:p>
@@ -1265,6 +1451,10 @@
               <w:pStyle w:val="Compact"/>
             </w:pPr>
             <w:r>
+              <w:rPr>
+                <w:rFonts w:ascii="Trebuchet MS" w:hAnsi="Trebuchet MS"/>
+                <w:sz w:val="19"/>
+              </w:rPr>
               <w:t xml:space="preserve">ETS additive trend + additive seasonal</w:t>
             </w:r>
           </w:p>
@@ -1277,6 +1467,10 @@
               <w:jc w:val="right"/>
             </w:pPr>
             <w:r>
+              <w:rPr>
+                <w:rFonts w:ascii="Trebuchet MS" w:hAnsi="Trebuchet MS"/>
+                <w:sz w:val="19"/>
+              </w:rPr>
               <w:t xml:space="preserve">9.79</w:t>
             </w:r>
           </w:p>
@@ -1289,6 +1483,10 @@
               <w:jc w:val="right"/>
             </w:pPr>
             <w:r>
+              <w:rPr>
+                <w:rFonts w:ascii="Trebuchet MS" w:hAnsi="Trebuchet MS"/>
+                <w:sz w:val="19"/>
+              </w:rPr>
               <w:t xml:space="preserve">12.03</w:t>
             </w:r>
           </w:p>
@@ -1301,6 +1499,10 @@
               <w:jc w:val="right"/>
             </w:pPr>
             <w:r>
+              <w:rPr>
+                <w:rFonts w:ascii="Trebuchet MS" w:hAnsi="Trebuchet MS"/>
+                <w:sz w:val="19"/>
+              </w:rPr>
               <w:t xml:space="preserve">−0.07</w:t>
             </w:r>
           </w:p>
@@ -1338,11 +1540,12 @@
     <w:p>
       <w:pPr>
         <w:pStyle w:val="CaptionedFigure"/>
+        <w:jc w:val="center"/>
       </w:pPr>
       <w:r>
         <w:drawing>
           <wp:inline>
-            <wp:extent cx="5334000" cy="2039929"/>
+            <wp:extent cx="5334000" cy="2102724"/>
             <wp:effectExtent b="0" l="0" r="0" t="0"/>
             <wp:docPr descr="Figure 6. Rolling two-day forecasts vs actual, final 30 validation origins" title="" id="26" name="Picture"/>
             <a:graphic>
@@ -1363,7 +1566,7 @@
                   <pic:spPr bwMode="auto">
                     <a:xfrm>
                       <a:off x="0" y="0"/>
-                      <a:ext cx="5334000" cy="2039929"/>
+                      <a:ext cx="5334000" cy="2102724"/>
                     </a:xfrm>
                     <a:prstGeom prst="rect">
                       <a:avLst/>
@@ -1385,6 +1588,7 @@
     <w:p>
       <w:pPr>
         <w:pStyle w:val="ImageCaption"/>
+        <w:jc w:val="center"/>
       </w:pPr>
       <w:r>
         <w:t xml:space="preserve">Figure 6. Rolling two-day forecasts vs actual, final 30 validation origins</w:t>
@@ -1414,12 +1618,12 @@
         <w:tblW w:type="auto" w:w="0"/>
         <w:tblLook w:firstRow="1" w:lastRow="0" w:firstColumn="0" w:lastColumn="0" w:noHBand="0" w:noVBand="0" w:val="0020"/>
         <w:tblBorders>
-          <w:top w:val="single" w:sz="4" w:color="999999"/>
-          <w:left w:val="single" w:sz="4" w:color="999999"/>
-          <w:bottom w:val="single" w:sz="4" w:color="999999"/>
-          <w:right w:val="single" w:sz="4" w:color="999999"/>
-          <w:insideH w:val="single" w:sz="4" w:color="999999"/>
-          <w:insideV w:val="single" w:sz="4" w:color="999999"/>
+          <w:top w:val="single" w:sz="12" w:color="0D9488"/>
+          <w:bottom w:val="single" w:sz="12" w:color="0D9488"/>
+          <w:insideH w:val="dotted" w:sz="4" w:color="94A3B8"/>
+          <w:left w:val="nil" w:sz="0" w:color="auto"/>
+          <w:right w:val="nil" w:sz="0" w:color="auto"/>
+          <w:insideV w:val="nil" w:sz="0" w:color="auto"/>
         </w:tblBorders>
       </w:tblPr>
       <w:tblGrid>
@@ -1433,59 +1637,79 @@
           <w:tblHeader w:val="on"/>
         </w:trPr>
         <w:tc>
-          <w:tcPr/>
-          <w:p>
-            <w:pPr>
-              <w:pStyle w:val="Compact"/>
-            </w:pPr>
-            <w:r>
-              <w:rPr>
+          <w:tcPr>
+            <w:shd w:val="clear" w:color="auto" w:fill="0D9488"/>
+          </w:tcPr>
+          <w:p>
+            <w:pPr>
+              <w:pStyle w:val="Compact"/>
+            </w:pPr>
+            <w:r>
+              <w:rPr>
+                <w:rFonts w:ascii="Trebuchet MS" w:hAnsi="Trebuchet MS"/>
                 <w:b/>
+                <w:color w:val="FFFFFF"/>
+                <w:sz w:val="19"/>
               </w:rPr>
               <w:t xml:space="preserve">MA7</w:t>
             </w:r>
           </w:p>
         </w:tc>
         <w:tc>
-          <w:tcPr/>
-          <w:p>
-            <w:pPr>
-              <w:pStyle w:val="Compact"/>
-              <w:jc w:val="right"/>
-            </w:pPr>
-            <w:r>
-              <w:rPr>
+          <w:tcPr>
+            <w:shd w:val="clear" w:color="auto" w:fill="0D9488"/>
+          </w:tcPr>
+          <w:p>
+            <w:pPr>
+              <w:pStyle w:val="Compact"/>
+              <w:jc w:val="right"/>
+            </w:pPr>
+            <w:r>
+              <w:rPr>
+                <w:rFonts w:ascii="Trebuchet MS" w:hAnsi="Trebuchet MS"/>
                 <w:b/>
+                <w:color w:val="FFFFFF"/>
+                <w:sz w:val="19"/>
               </w:rPr>
               <w:t xml:space="preserve">MAE</w:t>
             </w:r>
           </w:p>
         </w:tc>
         <w:tc>
-          <w:tcPr/>
-          <w:p>
-            <w:pPr>
-              <w:pStyle w:val="Compact"/>
-              <w:jc w:val="right"/>
-            </w:pPr>
-            <w:r>
-              <w:rPr>
+          <w:tcPr>
+            <w:shd w:val="clear" w:color="auto" w:fill="0D9488"/>
+          </w:tcPr>
+          <w:p>
+            <w:pPr>
+              <w:pStyle w:val="Compact"/>
+              <w:jc w:val="right"/>
+            </w:pPr>
+            <w:r>
+              <w:rPr>
+                <w:rFonts w:ascii="Trebuchet MS" w:hAnsi="Trebuchet MS"/>
                 <w:b/>
+                <w:color w:val="FFFFFF"/>
+                <w:sz w:val="19"/>
               </w:rPr>
               <w:t xml:space="preserve">RMSE</w:t>
             </w:r>
           </w:p>
         </w:tc>
         <w:tc>
-          <w:tcPr/>
-          <w:p>
-            <w:pPr>
-              <w:pStyle w:val="Compact"/>
-              <w:jc w:val="right"/>
-            </w:pPr>
-            <w:r>
-              <w:rPr>
+          <w:tcPr>
+            <w:shd w:val="clear" w:color="auto" w:fill="0D9488"/>
+          </w:tcPr>
+          <w:p>
+            <w:pPr>
+              <w:pStyle w:val="Compact"/>
+              <w:jc w:val="right"/>
+            </w:pPr>
+            <w:r>
+              <w:rPr>
+                <w:rFonts w:ascii="Trebuchet MS" w:hAnsi="Trebuchet MS"/>
                 <w:b/>
+                <w:color w:val="FFFFFF"/>
+                <w:sz w:val="19"/>
               </w:rPr>
               <w:t xml:space="preserve">Mean error</w:t>
             </w:r>
@@ -1500,6 +1724,10 @@
               <w:pStyle w:val="Compact"/>
             </w:pPr>
             <w:r>
+              <w:rPr>
+                <w:rFonts w:ascii="Trebuchet MS" w:hAnsi="Trebuchet MS"/>
+                <w:sz w:val="19"/>
+              </w:rPr>
               <w:t xml:space="preserve">Validation</w:t>
             </w:r>
           </w:p>
@@ -1512,6 +1740,10 @@
               <w:jc w:val="right"/>
             </w:pPr>
             <w:r>
+              <w:rPr>
+                <w:rFonts w:ascii="Trebuchet MS" w:hAnsi="Trebuchet MS"/>
+                <w:sz w:val="19"/>
+              </w:rPr>
               <w:t xml:space="preserve">4.92</w:t>
             </w:r>
           </w:p>
@@ -1524,6 +1756,10 @@
               <w:jc w:val="right"/>
             </w:pPr>
             <w:r>
+              <w:rPr>
+                <w:rFonts w:ascii="Trebuchet MS" w:hAnsi="Trebuchet MS"/>
+                <w:sz w:val="19"/>
+              </w:rPr>
               <w:t xml:space="preserve">6.57</w:t>
             </w:r>
           </w:p>
@@ -1536,6 +1772,10 @@
               <w:jc w:val="right"/>
             </w:pPr>
             <w:r>
+              <w:rPr>
+                <w:rFonts w:ascii="Trebuchet MS" w:hAnsi="Trebuchet MS"/>
+                <w:sz w:val="19"/>
+              </w:rPr>
               <w:t xml:space="preserve">−0.14</w:t>
             </w:r>
           </w:p>
@@ -1543,48 +1783,72 @@
       </w:tr>
       <w:tr>
         <w:tc>
-          <w:tcPr/>
-          <w:p>
-            <w:pPr>
-              <w:pStyle w:val="Compact"/>
-            </w:pPr>
-            <w:r>
+          <w:tcPr>
+            <w:shd w:val="clear" w:color="auto" w:fill="F1F5F4"/>
+          </w:tcPr>
+          <w:p>
+            <w:pPr>
+              <w:pStyle w:val="Compact"/>
+            </w:pPr>
+            <w:r>
+              <w:rPr>
+                <w:rFonts w:ascii="Trebuchet MS" w:hAnsi="Trebuchet MS"/>
+                <w:sz w:val="19"/>
+              </w:rPr>
               <w:t xml:space="preserve">Test</w:t>
             </w:r>
           </w:p>
         </w:tc>
         <w:tc>
-          <w:tcPr/>
-          <w:p>
-            <w:pPr>
-              <w:pStyle w:val="Compact"/>
-              <w:jc w:val="right"/>
-            </w:pPr>
-            <w:r>
+          <w:tcPr>
+            <w:shd w:val="clear" w:color="auto" w:fill="F1F5F4"/>
+          </w:tcPr>
+          <w:p>
+            <w:pPr>
+              <w:pStyle w:val="Compact"/>
+              <w:jc w:val="right"/>
+            </w:pPr>
+            <w:r>
+              <w:rPr>
+                <w:rFonts w:ascii="Trebuchet MS" w:hAnsi="Trebuchet MS"/>
+                <w:sz w:val="19"/>
+              </w:rPr>
               <w:t xml:space="preserve">4.85</w:t>
             </w:r>
           </w:p>
         </w:tc>
         <w:tc>
-          <w:tcPr/>
-          <w:p>
-            <w:pPr>
-              <w:pStyle w:val="Compact"/>
-              <w:jc w:val="right"/>
-            </w:pPr>
-            <w:r>
+          <w:tcPr>
+            <w:shd w:val="clear" w:color="auto" w:fill="F1F5F4"/>
+          </w:tcPr>
+          <w:p>
+            <w:pPr>
+              <w:pStyle w:val="Compact"/>
+              <w:jc w:val="right"/>
+            </w:pPr>
+            <w:r>
+              <w:rPr>
+                <w:rFonts w:ascii="Trebuchet MS" w:hAnsi="Trebuchet MS"/>
+                <w:sz w:val="19"/>
+              </w:rPr>
               <w:t xml:space="preserve">6.14</w:t>
             </w:r>
           </w:p>
         </w:tc>
         <w:tc>
-          <w:tcPr/>
-          <w:p>
-            <w:pPr>
-              <w:pStyle w:val="Compact"/>
-              <w:jc w:val="right"/>
-            </w:pPr>
-            <w:r>
+          <w:tcPr>
+            <w:shd w:val="clear" w:color="auto" w:fill="F1F5F4"/>
+          </w:tcPr>
+          <w:p>
+            <w:pPr>
+              <w:pStyle w:val="Compact"/>
+              <w:jc w:val="right"/>
+            </w:pPr>
+            <w:r>
+              <w:rPr>
+                <w:rFonts w:ascii="Trebuchet MS" w:hAnsi="Trebuchet MS"/>
+                <w:sz w:val="19"/>
+              </w:rPr>
               <w:t xml:space="preserve">−0.12</w:t>
             </w:r>
           </w:p>
@@ -1602,11 +1866,12 @@
     <w:p>
       <w:pPr>
         <w:pStyle w:val="CaptionedFigure"/>
+        <w:jc w:val="center"/>
       </w:pPr>
       <w:r>
         <w:drawing>
           <wp:inline>
-            <wp:extent cx="5334000" cy="2024742"/>
+            <wp:extent cx="5334000" cy="1986234"/>
             <wp:effectExtent b="0" l="0" r="0" t="0"/>
             <wp:docPr descr="Figure 7. MA7 rolling two-day forecasts on the test block" title="" id="29" name="Picture"/>
             <a:graphic>
@@ -1627,7 +1892,7 @@
                   <pic:spPr bwMode="auto">
                     <a:xfrm>
                       <a:off x="0" y="0"/>
-                      <a:ext cx="5334000" cy="2024742"/>
+                      <a:ext cx="5334000" cy="1986234"/>
                     </a:xfrm>
                     <a:prstGeom prst="rect">
                       <a:avLst/>
@@ -1649,6 +1914,7 @@
     <w:p>
       <w:pPr>
         <w:pStyle w:val="ImageCaption"/>
+        <w:jc w:val="center"/>
       </w:pPr>
       <w:r>
         <w:t xml:space="preserve">Figure 7. MA7 rolling two-day forecasts on the test block</w:t>
@@ -1659,6 +1925,9 @@
     <w:p>
       <w:pPr>
         <w:pStyle w:val="Heading2"/>
+        <w:pBdr>
+          <w:bottom w:val="single" w:sz="8" w:space="2" w:color="7C3AED"/>
+        </w:pBdr>
       </w:pPr>
       <w:r>
         <w:t xml:space="preserve">Question 3 — Continuous review (Q, R)</w:t>
@@ -1947,11 +2216,12 @@
     <w:p>
       <w:pPr>
         <w:pStyle w:val="CaptionedFigure"/>
+        <w:jc w:val="center"/>
       </w:pPr>
       <w:r>
         <w:drawing>
           <wp:inline>
-            <wp:extent cx="5334000" cy="2030960"/>
+            <wp:extent cx="5334000" cy="1990218"/>
             <wp:effectExtent b="0" l="0" r="0" t="0"/>
             <wp:docPr descr="Figure 8. Forecast-based reorder point by test day vs fixed Normal R" title="" id="33" name="Picture"/>
             <a:graphic>
@@ -1972,7 +2242,7 @@
                   <pic:spPr bwMode="auto">
                     <a:xfrm>
                       <a:off x="0" y="0"/>
-                      <a:ext cx="5334000" cy="2030960"/>
+                      <a:ext cx="5334000" cy="1990218"/>
                     </a:xfrm>
                     <a:prstGeom prst="rect">
                       <a:avLst/>
@@ -1994,6 +2264,7 @@
     <w:p>
       <w:pPr>
         <w:pStyle w:val="ImageCaption"/>
+        <w:jc w:val="center"/>
       </w:pPr>
       <w:r>
         <w:t xml:space="preserve">Figure 8. Forecast-based reorder point by test day vs fixed Normal R</w:t>
@@ -2005,6 +2276,7 @@
       <w:footnotePr>
         <w:numRestart w:val="eachSect"/>
       </w:footnotePr>
+      <w:pgMar w:left="1296" w:right="1296" w:top="1152" w:bottom="1152"/>
     </w:sectPr>
   </w:body>
 </w:document>
@@ -2138,6 +2410,11 @@
   <w:style w:default="1" w:styleId="Normal" w:type="paragraph">
     <w:name w:val="Normal"/>
     <w:qFormat/>
+    <w:rPr>
+      <w:rFonts w:ascii="Georgia" w:hAnsi="Georgia" w:cs="Georgia" w:eastAsia="Georgia"/>
+      <w:color w:val="334155"/>
+      <w:sz w:val="21"/>
+    </w:rPr>
   </w:style>
   <w:style w:styleId="BodyText" w:type="paragraph">
     <w:name w:val="Body Text"/>
@@ -2147,12 +2424,22 @@
     <w:pPr>
       <w:spacing w:after="180" w:before="180"/>
     </w:pPr>
+    <w:rPr>
+      <w:rFonts w:ascii="Georgia" w:hAnsi="Georgia" w:cs="Georgia" w:eastAsia="Georgia"/>
+      <w:color w:val="334155"/>
+      <w:sz w:val="21"/>
+    </w:rPr>
   </w:style>
   <w:style w:customStyle="1" w:styleId="FirstParagraph" w:type="paragraph">
     <w:name w:val="First Paragraph"/>
     <w:basedOn w:val="BodyText"/>
     <w:next w:val="BodyText"/>
     <w:qFormat/>
+    <w:rPr>
+      <w:rFonts w:ascii="Georgia" w:hAnsi="Georgia" w:cs="Georgia" w:eastAsia="Georgia"/>
+      <w:color w:val="334155"/>
+      <w:sz w:val="21"/>
+    </w:rPr>
   </w:style>
   <w:style w:customStyle="1" w:styleId="Compact" w:type="paragraph">
     <w:name w:val="Compact"/>
@@ -2161,6 +2448,11 @@
     <w:pPr>
       <w:spacing w:after="36" w:before="36"/>
     </w:pPr>
+    <w:rPr>
+      <w:rFonts w:ascii="Georgia" w:hAnsi="Georgia" w:cs="Georgia" w:eastAsia="Georgia"/>
+      <w:color w:val="334155"/>
+      <w:sz w:val="21"/>
+    </w:rPr>
   </w:style>
   <w:style w:styleId="Title" w:type="paragraph">
     <w:name w:val="Title"/>
@@ -2310,8 +2602,9 @@
       <w:outlineLvl w:val="0"/>
     </w:pPr>
     <w:rPr>
-      <w:rFonts w:asciiTheme="majorHAnsi" w:cstheme="majorBidi" w:eastAsiaTheme="majorEastAsia" w:hAnsiTheme="majorHAnsi"/>
-      <w:color w:themeColor="accent1" w:themeShade="BF" w:val="0F4761"/>
+      <w:rFonts w:ascii="Trebuchet MS" w:hAnsi="Trebuchet MS" w:cs="Trebuchet MS" w:eastAsia="Trebuchet MS"/>
+      <w:b/>
+      <w:color w:val="0D9488"/>
       <w:sz w:val="40"/>
       <w:szCs w:val="40"/>
     </w:rPr>
@@ -2333,9 +2626,10 @@
       <w:outlineLvl w:val="1"/>
     </w:pPr>
     <w:rPr>
-      <w:rFonts w:asciiTheme="majorHAnsi" w:cstheme="majorBidi" w:eastAsiaTheme="majorEastAsia" w:hAnsiTheme="majorHAnsi"/>
-      <w:color w:themeColor="accent1" w:themeShade="BF" w:val="0F4761"/>
-      <w:sz w:val="32"/>
+      <w:rFonts w:ascii="Trebuchet MS" w:hAnsi="Trebuchet MS" w:cs="Trebuchet MS" w:eastAsia="Trebuchet MS"/>
+      <w:b/>
+      <w:color w:val="7C3AED"/>
+      <w:sz w:val="28"/>
       <w:szCs w:val="32"/>
     </w:rPr>
   </w:style>
@@ -2712,6 +3006,13 @@
   <w:style w:customStyle="1" w:styleId="ImageCaption" w:type="paragraph">
     <w:name w:val="Image Caption"/>
     <w:basedOn w:val="Caption"/>
+    <w:rPr>
+      <w:rFonts w:ascii="Georgia" w:hAnsi="Georgia" w:cs="Georgia" w:eastAsia="Georgia"/>
+      <w:b w:val="0"/>
+      <w:i/>
+      <w:color w:val="C2410C"/>
+      <w:sz w:val="18"/>
+    </w:rPr>
   </w:style>
   <w:style w:customStyle="1" w:styleId="Figure" w:type="paragraph">
     <w:name w:val="Figure"/>

</xml_diff>

<commit_message>
Revert fonts and colours to defaults; keep new figure layouts
Co-Authored-By: Claude Opus 5.5 <noreply@anthropic.com>
Claude-Session: https://claude.ai/code/session_015xCXyYN8m36HffbEQaovsv
</commit_message>
<xml_diff>
--- a/hw2/HW2_Report.docx
+++ b/hw2/HW2_Report.docx
@@ -6,7 +6,6 @@
     <w:p>
       <w:pPr>
         <w:pStyle w:val="Heading1"/>
-        <w:jc w:val="center"/>
       </w:pPr>
       <w:r>
         <w:t xml:space="preserve">OPIM 348 — Homework 2 Report</w:t>
@@ -133,9 +132,6 @@
     <w:p>
       <w:pPr>
         <w:pStyle w:val="Heading2"/>
-        <w:pBdr>
-          <w:bottom w:val="single" w:sz="8" w:space="2" w:color="7C3AED"/>
-        </w:pBdr>
       </w:pPr>
       <w:r>
         <w:t xml:space="preserve">Question 1 — Operating room booking</w:t>
@@ -194,12 +190,11 @@
     <w:p>
       <w:pPr>
         <w:pStyle w:val="CaptionedFigure"/>
-        <w:jc w:val="center"/>
       </w:pPr>
       <w:r>
         <w:drawing>
           <wp:inline>
-            <wp:extent cx="3291840" cy="3322263"/>
+            <wp:extent cx="3291840" cy="3285822"/>
             <wp:effectExtent b="0" l="0" r="0" t="0"/>
             <wp:docPr descr="Figure 1. Actual occupancy vs booked time, with 45° line" title="" id="10" name="Picture"/>
             <a:graphic>
@@ -220,7 +215,7 @@
                   <pic:spPr bwMode="auto">
                     <a:xfrm>
                       <a:off x="0" y="0"/>
-                      <a:ext cx="3291840" cy="3322263"/>
+                      <a:ext cx="3291840" cy="3285822"/>
                     </a:xfrm>
                     <a:prstGeom prst="rect">
                       <a:avLst/>
@@ -242,7 +237,6 @@
     <w:p>
       <w:pPr>
         <w:pStyle w:val="ImageCaption"/>
-        <w:jc w:val="center"/>
       </w:pPr>
       <w:r>
         <w:t xml:space="preserve">Figure 1. Actual occupancy vs booked time, with 45° line</w:t>
@@ -380,12 +374,12 @@
         <w:tblLayout w:type="fixed"/>
         <w:tblLook w:firstRow="1" w:lastRow="0" w:firstColumn="0" w:lastColumn="0" w:noHBand="0" w:noVBand="0" w:val="0020"/>
         <w:tblBorders>
-          <w:top w:val="single" w:sz="12" w:color="0D9488"/>
-          <w:bottom w:val="single" w:sz="12" w:color="0D9488"/>
-          <w:insideH w:val="dotted" w:sz="4" w:color="94A3B8"/>
-          <w:left w:val="nil" w:sz="0" w:color="auto"/>
-          <w:right w:val="nil" w:sz="0" w:color="auto"/>
-          <w:insideV w:val="nil" w:sz="0" w:color="auto"/>
+          <w:top w:val="single" w:sz="4" w:color="999999"/>
+          <w:left w:val="single" w:sz="4" w:color="999999"/>
+          <w:bottom w:val="single" w:sz="4" w:color="999999"/>
+          <w:right w:val="single" w:sz="4" w:color="999999"/>
+          <w:insideH w:val="single" w:sz="4" w:color="999999"/>
+          <w:insideV w:val="single" w:sz="4" w:color="999999"/>
         </w:tblBorders>
       </w:tblPr>
       <w:tblGrid>
@@ -400,28 +394,21 @@
           <w:tblHeader w:val="on"/>
         </w:trPr>
         <w:tc>
-          <w:tcPr>
-            <w:shd w:val="clear" w:color="auto" w:fill="0D9488"/>
-          </w:tcPr>
+          <w:tcPr/>
           <w:p>
             <w:pPr>
               <w:pStyle w:val="Compact"/>
             </w:pPr>
             <w:r>
               <w:rPr>
-                <w:rFonts w:ascii="Trebuchet MS" w:hAnsi="Trebuchet MS"/>
                 <w:b/>
-                <w:color w:val="FFFFFF"/>
-                <w:sz w:val="19"/>
               </w:rPr>
               <w:t xml:space="preserve">Policy (test set, n = 435)</w:t>
             </w:r>
           </w:p>
         </w:tc>
         <w:tc>
-          <w:tcPr>
-            <w:shd w:val="clear" w:color="auto" w:fill="0D9488"/>
-          </w:tcPr>
+          <w:tcPr/>
           <w:p>
             <w:pPr>
               <w:pStyle w:val="Compact"/>
@@ -429,19 +416,14 @@
             </w:pPr>
             <w:r>
               <w:rPr>
-                <w:rFonts w:ascii="Trebuchet MS" w:hAnsi="Trebuchet MS"/>
                 <w:b/>
-                <w:color w:val="FFFFFF"/>
-                <w:sz w:val="19"/>
               </w:rPr>
               <w:t xml:space="preserve">Total cost</w:t>
             </w:r>
           </w:p>
         </w:tc>
         <w:tc>
-          <w:tcPr>
-            <w:shd w:val="clear" w:color="auto" w:fill="0D9488"/>
-          </w:tcPr>
+          <w:tcPr/>
           <w:p>
             <w:pPr>
               <w:pStyle w:val="Compact"/>
@@ -449,19 +431,14 @@
             </w:pPr>
             <w:r>
               <w:rPr>
-                <w:rFonts w:ascii="Trebuchet MS" w:hAnsi="Trebuchet MS"/>
                 <w:b/>
-                <w:color w:val="FFFFFF"/>
-                <w:sz w:val="19"/>
               </w:rPr>
               <w:t xml:space="preserve">Unused min</w:t>
             </w:r>
           </w:p>
         </w:tc>
         <w:tc>
-          <w:tcPr>
-            <w:shd w:val="clear" w:color="auto" w:fill="0D9488"/>
-          </w:tcPr>
+          <w:tcPr/>
           <w:p>
             <w:pPr>
               <w:pStyle w:val="Compact"/>
@@ -469,19 +446,14 @@
             </w:pPr>
             <w:r>
               <w:rPr>
-                <w:rFonts w:ascii="Trebuchet MS" w:hAnsi="Trebuchet MS"/>
                 <w:b/>
-                <w:color w:val="FFFFFF"/>
-                <w:sz w:val="19"/>
               </w:rPr>
               <w:t xml:space="preserve">Overrun min</w:t>
             </w:r>
           </w:p>
         </w:tc>
         <w:tc>
-          <w:tcPr>
-            <w:shd w:val="clear" w:color="auto" w:fill="0D9488"/>
-          </w:tcPr>
+          <w:tcPr/>
           <w:p>
             <w:pPr>
               <w:pStyle w:val="Compact"/>
@@ -489,10 +461,7 @@
             </w:pPr>
             <w:r>
               <w:rPr>
-                <w:rFonts w:ascii="Trebuchet MS" w:hAnsi="Trebuchet MS"/>
                 <w:b/>
-                <w:color w:val="FFFFFF"/>
-                <w:sz w:val="19"/>
               </w:rPr>
               <w:t xml:space="preserve">% overrun</w:t>
             </w:r>
@@ -507,10 +476,6 @@
               <w:pStyle w:val="Compact"/>
             </w:pPr>
             <w:r>
-              <w:rPr>
-                <w:rFonts w:ascii="Trebuchet MS" w:hAnsi="Trebuchet MS"/>
-                <w:sz w:val="19"/>
-              </w:rPr>
               <w:t xml:space="preserve">Historical booking</w:t>
             </w:r>
           </w:p>
@@ -523,10 +488,6 @@
               <w:jc w:val="right"/>
             </w:pPr>
             <w:r>
-              <w:rPr>
-                <w:rFonts w:ascii="Trebuchet MS" w:hAnsi="Trebuchet MS"/>
-                <w:sz w:val="19"/>
-              </w:rPr>
               <w:t xml:space="preserve">$336,400</w:t>
             </w:r>
           </w:p>
@@ -539,10 +500,6 @@
               <w:jc w:val="right"/>
             </w:pPr>
             <w:r>
-              <w:rPr>
-                <w:rFonts w:ascii="Trebuchet MS" w:hAnsi="Trebuchet MS"/>
-                <w:sz w:val="19"/>
-              </w:rPr>
               <w:t xml:space="preserve">1,755</w:t>
             </w:r>
           </w:p>
@@ -555,10 +512,6 @@
               <w:jc w:val="right"/>
             </w:pPr>
             <w:r>
-              <w:rPr>
-                <w:rFonts w:ascii="Trebuchet MS" w:hAnsi="Trebuchet MS"/>
-                <w:sz w:val="19"/>
-              </w:rPr>
               <w:t xml:space="preserve">3,218</w:t>
             </w:r>
           </w:p>
@@ -571,10 +524,6 @@
               <w:jc w:val="right"/>
             </w:pPr>
             <w:r>
-              <w:rPr>
-                <w:rFonts w:ascii="Trebuchet MS" w:hAnsi="Trebuchet MS"/>
-                <w:sz w:val="19"/>
-              </w:rPr>
               <w:t xml:space="preserve">61.4%</w:t>
             </w:r>
           </w:p>
@@ -582,90 +531,60 @@
       </w:tr>
       <w:tr>
         <w:tc>
-          <w:tcPr>
-            <w:shd w:val="clear" w:color="auto" w:fill="F1F5F4"/>
-          </w:tcPr>
-          <w:p>
-            <w:pPr>
-              <w:pStyle w:val="Compact"/>
-            </w:pPr>
-            <w:r>
-              <w:rPr>
-                <w:rFonts w:ascii="Trebuchet MS" w:hAnsi="Trebuchet MS"/>
-                <w:sz w:val="19"/>
-              </w:rPr>
+          <w:tcPr/>
+          <w:p>
+            <w:pPr>
+              <w:pStyle w:val="Compact"/>
+            </w:pPr>
+            <w:r>
               <w:t xml:space="preserve">Predicted mean</w:t>
             </w:r>
           </w:p>
         </w:tc>
         <w:tc>
-          <w:tcPr>
-            <w:shd w:val="clear" w:color="auto" w:fill="F1F5F4"/>
-          </w:tcPr>
-          <w:p>
-            <w:pPr>
-              <w:pStyle w:val="Compact"/>
-              <w:jc w:val="right"/>
-            </w:pPr>
-            <w:r>
-              <w:rPr>
-                <w:rFonts w:ascii="Trebuchet MS" w:hAnsi="Trebuchet MS"/>
-                <w:sz w:val="19"/>
-              </w:rPr>
+          <w:tcPr/>
+          <w:p>
+            <w:pPr>
+              <w:pStyle w:val="Compact"/>
+              <w:jc w:val="right"/>
+            </w:pPr>
+            <w:r>
               <w:t xml:space="preserve">$149,650</w:t>
             </w:r>
           </w:p>
         </w:tc>
         <w:tc>
-          <w:tcPr>
-            <w:shd w:val="clear" w:color="auto" w:fill="F1F5F4"/>
-          </w:tcPr>
-          <w:p>
-            <w:pPr>
-              <w:pStyle w:val="Compact"/>
-              <w:jc w:val="right"/>
-            </w:pPr>
-            <w:r>
-              <w:rPr>
-                <w:rFonts w:ascii="Trebuchet MS" w:hAnsi="Trebuchet MS"/>
-                <w:sz w:val="19"/>
-              </w:rPr>
+          <w:tcPr/>
+          <w:p>
+            <w:pPr>
+              <w:pStyle w:val="Compact"/>
+              <w:jc w:val="right"/>
+            </w:pPr>
+            <w:r>
               <w:t xml:space="preserve">873</w:t>
             </w:r>
           </w:p>
         </w:tc>
         <w:tc>
-          <w:tcPr>
-            <w:shd w:val="clear" w:color="auto" w:fill="F1F5F4"/>
-          </w:tcPr>
-          <w:p>
-            <w:pPr>
-              <w:pStyle w:val="Compact"/>
-              <w:jc w:val="right"/>
-            </w:pPr>
-            <w:r>
-              <w:rPr>
-                <w:rFonts w:ascii="Trebuchet MS" w:hAnsi="Trebuchet MS"/>
-                <w:sz w:val="19"/>
-              </w:rPr>
+          <w:tcPr/>
+          <w:p>
+            <w:pPr>
+              <w:pStyle w:val="Compact"/>
+              <w:jc w:val="right"/>
+            </w:pPr>
+            <w:r>
               <w:t xml:space="preserve">1,247</w:t>
             </w:r>
           </w:p>
         </w:tc>
         <w:tc>
-          <w:tcPr>
-            <w:shd w:val="clear" w:color="auto" w:fill="F1F5F4"/>
-          </w:tcPr>
-          <w:p>
-            <w:pPr>
-              <w:pStyle w:val="Compact"/>
-              <w:jc w:val="right"/>
-            </w:pPr>
-            <w:r>
-              <w:rPr>
-                <w:rFonts w:ascii="Trebuchet MS" w:hAnsi="Trebuchet MS"/>
-                <w:sz w:val="19"/>
-              </w:rPr>
+          <w:tcPr/>
+          <w:p>
+            <w:pPr>
+              <w:pStyle w:val="Compact"/>
+              <w:jc w:val="right"/>
+            </w:pPr>
+            <w:r>
               <w:t xml:space="preserve">42.8%</w:t>
             </w:r>
           </w:p>
@@ -679,10 +598,6 @@
               <w:pStyle w:val="Compact"/>
             </w:pPr>
             <w:r>
-              <w:rPr>
-                <w:rFonts w:ascii="Trebuchet MS" w:hAnsi="Trebuchet MS"/>
-                <w:sz w:val="19"/>
-              </w:rPr>
               <w:t xml:space="preserve">Cost-based, Normal (required)</w:t>
             </w:r>
           </w:p>
@@ -695,10 +610,6 @@
               <w:jc w:val="right"/>
             </w:pPr>
             <w:r>
-              <w:rPr>
-                <w:rFonts w:ascii="Trebuchet MS" w:hAnsi="Trebuchet MS"/>
-                <w:sz w:val="19"/>
-              </w:rPr>
               <w:t xml:space="preserve">$149,700</w:t>
             </w:r>
           </w:p>
@@ -711,10 +622,6 @@
               <w:jc w:val="right"/>
             </w:pPr>
             <w:r>
-              <w:rPr>
-                <w:rFonts w:ascii="Trebuchet MS" w:hAnsi="Trebuchet MS"/>
-                <w:sz w:val="19"/>
-              </w:rPr>
               <w:t xml:space="preserve">421</w:t>
             </w:r>
           </w:p>
@@ -727,10 +634,6 @@
               <w:jc w:val="right"/>
             </w:pPr>
             <w:r>
-              <w:rPr>
-                <w:rFonts w:ascii="Trebuchet MS" w:hAnsi="Trebuchet MS"/>
-                <w:sz w:val="19"/>
-              </w:rPr>
               <w:t xml:space="preserve">2,152</w:t>
             </w:r>
           </w:p>
@@ -743,10 +646,6 @@
               <w:jc w:val="right"/>
             </w:pPr>
             <w:r>
-              <w:rPr>
-                <w:rFonts w:ascii="Trebuchet MS" w:hAnsi="Trebuchet MS"/>
-                <w:sz w:val="19"/>
-              </w:rPr>
               <w:t xml:space="preserve">79.1%</w:t>
             </w:r>
           </w:p>
@@ -754,28 +653,22 @@
       </w:tr>
       <w:tr>
         <w:tc>
-          <w:tcPr>
-            <w:shd w:val="clear" w:color="auto" w:fill="F1F5F4"/>
-          </w:tcPr>
+          <w:tcPr/>
           <w:p>
             <w:pPr>
               <w:pStyle w:val="Compact"/>
             </w:pPr>
             <w:r>
               <w:rPr>
-                <w:rFonts w:ascii="Trebuchet MS" w:hAnsi="Trebuchet MS"/>
                 <w:i/>
                 <w:iCs/>
-                <w:sz w:val="19"/>
               </w:rPr>
               <w:t xml:space="preserve">Sensitivity: empirical 1/3 quantile of training residuals</w:t>
             </w:r>
           </w:p>
         </w:tc>
         <w:tc>
-          <w:tcPr>
-            <w:shd w:val="clear" w:color="auto" w:fill="F1F5F4"/>
-          </w:tcPr>
+          <w:tcPr/>
           <w:p>
             <w:pPr>
               <w:pStyle w:val="Compact"/>
@@ -783,19 +676,15 @@
             </w:pPr>
             <w:r>
               <w:rPr>
-                <w:rFonts w:ascii="Trebuchet MS" w:hAnsi="Trebuchet MS"/>
                 <w:i/>
                 <w:iCs/>
-                <w:sz w:val="19"/>
               </w:rPr>
               <w:t xml:space="preserve">$140,300</w:t>
             </w:r>
           </w:p>
         </w:tc>
         <w:tc>
-          <w:tcPr>
-            <w:shd w:val="clear" w:color="auto" w:fill="F1F5F4"/>
-          </w:tcPr>
+          <w:tcPr/>
           <w:p>
             <w:pPr>
               <w:pStyle w:val="Compact"/>
@@ -803,19 +692,15 @@
             </w:pPr>
             <w:r>
               <w:rPr>
-                <w:rFonts w:ascii="Trebuchet MS" w:hAnsi="Trebuchet MS"/>
                 <w:i/>
                 <w:iCs/>
-                <w:sz w:val="19"/>
               </w:rPr>
               <w:t xml:space="preserve">522</w:t>
             </w:r>
           </w:p>
         </w:tc>
         <w:tc>
-          <w:tcPr>
-            <w:shd w:val="clear" w:color="auto" w:fill="F1F5F4"/>
-          </w:tcPr>
+          <w:tcPr/>
           <w:p>
             <w:pPr>
               <w:pStyle w:val="Compact"/>
@@ -823,19 +708,15 @@
             </w:pPr>
             <w:r>
               <w:rPr>
-                <w:rFonts w:ascii="Trebuchet MS" w:hAnsi="Trebuchet MS"/>
                 <w:i/>
                 <w:iCs/>
-                <w:sz w:val="19"/>
               </w:rPr>
               <w:t xml:space="preserve">1,762</w:t>
             </w:r>
           </w:p>
         </w:tc>
         <w:tc>
-          <w:tcPr>
-            <w:shd w:val="clear" w:color="auto" w:fill="F1F5F4"/>
-          </w:tcPr>
+          <w:tcPr/>
           <w:p>
             <w:pPr>
               <w:pStyle w:val="Compact"/>
@@ -843,10 +724,8 @@
             </w:pPr>
             <w:r>
               <w:rPr>
-                <w:rFonts w:ascii="Trebuchet MS" w:hAnsi="Trebuchet MS"/>
                 <w:i/>
                 <w:iCs/>
-                <w:sz w:val="19"/>
               </w:rPr>
               <w:t xml:space="preserve">64.1%</w:t>
             </w:r>
@@ -865,7 +744,6 @@
     <w:p>
       <w:pPr>
         <w:pStyle w:val="CaptionedFigure"/>
-        <w:jc w:val="center"/>
       </w:pPr>
       <w:r>
         <w:drawing>
@@ -913,7 +791,6 @@
     <w:p>
       <w:pPr>
         <w:pStyle w:val="ImageCaption"/>
-        <w:jc w:val="center"/>
       </w:pPr>
       <w:r>
         <w:t xml:space="preserve">Figure 2. Test mismatch cost by booking policy</w:t>
@@ -922,7 +799,6 @@
     <w:p>
       <w:pPr>
         <w:pStyle w:val="CaptionedFigure"/>
-        <w:jc w:val="center"/>
       </w:pPr>
       <w:r>
         <w:drawing>
@@ -970,7 +846,6 @@
     <w:p>
       <w:pPr>
         <w:pStyle w:val="ImageCaption"/>
-        <w:jc w:val="center"/>
       </w:pPr>
       <w:r>
         <w:t xml:space="preserve">Figure 3. Training residuals vs Normal approximation</w:t>
@@ -999,9 +874,6 @@
     <w:p>
       <w:pPr>
         <w:pStyle w:val="Heading2"/>
-        <w:pBdr>
-          <w:bottom w:val="single" w:sz="8" w:space="2" w:color="7C3AED"/>
-        </w:pBdr>
       </w:pPr>
       <w:r>
         <w:t xml:space="preserve">Question 2 — Two-day sales forecasting</w:t>
@@ -1065,7 +937,6 @@
     <w:p>
       <w:pPr>
         <w:pStyle w:val="CaptionedFigure"/>
-        <w:jc w:val="center"/>
       </w:pPr>
       <w:r>
         <w:drawing>
@@ -1113,7 +984,6 @@
     <w:p>
       <w:pPr>
         <w:pStyle w:val="ImageCaption"/>
-        <w:jc w:val="center"/>
       </w:pPr>
       <w:r>
         <w:t xml:space="preserve">Figure 4. Daily sales with training / validation / test blocks</w:t>
@@ -1122,12 +992,11 @@
     <w:p>
       <w:pPr>
         <w:pStyle w:val="CaptionedFigure"/>
-        <w:jc w:val="center"/>
       </w:pPr>
       <w:r>
         <w:drawing>
           <wp:inline>
-            <wp:extent cx="4389120" cy="2182501"/>
+            <wp:extent cx="4389120" cy="2173545"/>
             <wp:effectExtent b="0" l="0" r="0" t="0"/>
             <wp:docPr descr="Figure 5. Mean daily sales by weekday" title="" id="23" name="Picture"/>
             <a:graphic>
@@ -1148,7 +1017,7 @@
                   <pic:spPr bwMode="auto">
                     <a:xfrm>
                       <a:off x="0" y="0"/>
-                      <a:ext cx="4389120" cy="2182501"/>
+                      <a:ext cx="4389120" cy="2173545"/>
                     </a:xfrm>
                     <a:prstGeom prst="rect">
                       <a:avLst/>
@@ -1170,7 +1039,6 @@
     <w:p>
       <w:pPr>
         <w:pStyle w:val="ImageCaption"/>
-        <w:jc w:val="center"/>
       </w:pPr>
       <w:r>
         <w:t xml:space="preserve">Figure 5. Mean daily sales by weekday</w:t>
@@ -1201,12 +1069,12 @@
         <w:tblLayout w:type="fixed"/>
         <w:tblLook w:firstRow="1" w:lastRow="0" w:firstColumn="0" w:lastColumn="0" w:noHBand="0" w:noVBand="0" w:val="0020"/>
         <w:tblBorders>
-          <w:top w:val="single" w:sz="12" w:color="0D9488"/>
-          <w:bottom w:val="single" w:sz="12" w:color="0D9488"/>
-          <w:insideH w:val="dotted" w:sz="4" w:color="94A3B8"/>
-          <w:left w:val="nil" w:sz="0" w:color="auto"/>
-          <w:right w:val="nil" w:sz="0" w:color="auto"/>
-          <w:insideV w:val="nil" w:sz="0" w:color="auto"/>
+          <w:top w:val="single" w:sz="4" w:color="999999"/>
+          <w:left w:val="single" w:sz="4" w:color="999999"/>
+          <w:bottom w:val="single" w:sz="4" w:color="999999"/>
+          <w:right w:val="single" w:sz="4" w:color="999999"/>
+          <w:insideH w:val="single" w:sz="4" w:color="999999"/>
+          <w:insideV w:val="single" w:sz="4" w:color="999999"/>
         </w:tblBorders>
       </w:tblPr>
       <w:tblGrid>
@@ -1220,28 +1088,21 @@
           <w:tblHeader w:val="on"/>
         </w:trPr>
         <w:tc>
-          <w:tcPr>
-            <w:shd w:val="clear" w:color="auto" w:fill="0D9488"/>
-          </w:tcPr>
+          <w:tcPr/>
           <w:p>
             <w:pPr>
               <w:pStyle w:val="Compact"/>
             </w:pPr>
             <w:r>
               <w:rPr>
-                <w:rFonts w:ascii="Trebuchet MS" w:hAnsi="Trebuchet MS"/>
                 <w:b/>
-                <w:color w:val="FFFFFF"/>
-                <w:sz w:val="19"/>
               </w:rPr>
               <w:t xml:space="preserve">Model (validation, two-day totals)</w:t>
             </w:r>
           </w:p>
         </w:tc>
         <w:tc>
-          <w:tcPr>
-            <w:shd w:val="clear" w:color="auto" w:fill="0D9488"/>
-          </w:tcPr>
+          <w:tcPr/>
           <w:p>
             <w:pPr>
               <w:pStyle w:val="Compact"/>
@@ -1249,19 +1110,14 @@
             </w:pPr>
             <w:r>
               <w:rPr>
-                <w:rFonts w:ascii="Trebuchet MS" w:hAnsi="Trebuchet MS"/>
                 <w:b/>
-                <w:color w:val="FFFFFF"/>
-                <w:sz w:val="19"/>
               </w:rPr>
               <w:t xml:space="preserve">MAE</w:t>
             </w:r>
           </w:p>
         </w:tc>
         <w:tc>
-          <w:tcPr>
-            <w:shd w:val="clear" w:color="auto" w:fill="0D9488"/>
-          </w:tcPr>
+          <w:tcPr/>
           <w:p>
             <w:pPr>
               <w:pStyle w:val="Compact"/>
@@ -1269,19 +1125,14 @@
             </w:pPr>
             <w:r>
               <w:rPr>
-                <w:rFonts w:ascii="Trebuchet MS" w:hAnsi="Trebuchet MS"/>
                 <w:b/>
-                <w:color w:val="FFFFFF"/>
-                <w:sz w:val="19"/>
               </w:rPr>
               <w:t xml:space="preserve">RMSE</w:t>
             </w:r>
           </w:p>
         </w:tc>
         <w:tc>
-          <w:tcPr>
-            <w:shd w:val="clear" w:color="auto" w:fill="0D9488"/>
-          </w:tcPr>
+          <w:tcPr/>
           <w:p>
             <w:pPr>
               <w:pStyle w:val="Compact"/>
@@ -1289,10 +1140,7 @@
             </w:pPr>
             <w:r>
               <w:rPr>
-                <w:rFonts w:ascii="Trebuchet MS" w:hAnsi="Trebuchet MS"/>
                 <w:b/>
-                <w:color w:val="FFFFFF"/>
-                <w:sz w:val="19"/>
               </w:rPr>
               <w:t xml:space="preserve">Mean error (actual − pred)</w:t>
             </w:r>
@@ -1308,10 +1156,8 @@
             </w:pPr>
             <w:r>
               <w:rPr>
-                <w:rFonts w:ascii="Trebuchet MS" w:hAnsi="Trebuchet MS"/>
                 <w:b/>
                 <w:bCs/>
-                <w:sz w:val="19"/>
               </w:rPr>
               <w:t xml:space="preserve">MA7</w:t>
             </w:r>
@@ -1326,10 +1172,8 @@
             </w:pPr>
             <w:r>
               <w:rPr>
-                <w:rFonts w:ascii="Trebuchet MS" w:hAnsi="Trebuchet MS"/>
                 <w:b/>
                 <w:bCs/>
-                <w:sz w:val="19"/>
               </w:rPr>
               <w:t xml:space="preserve">4.92</w:t>
             </w:r>
@@ -1344,10 +1188,8 @@
             </w:pPr>
             <w:r>
               <w:rPr>
-                <w:rFonts w:ascii="Trebuchet MS" w:hAnsi="Trebuchet MS"/>
                 <w:b/>
                 <w:bCs/>
-                <w:sz w:val="19"/>
               </w:rPr>
               <w:t xml:space="preserve">6.57</w:t>
             </w:r>
@@ -1361,10 +1203,6 @@
               <w:jc w:val="right"/>
             </w:pPr>
             <w:r>
-              <w:rPr>
-                <w:rFonts w:ascii="Trebuchet MS" w:hAnsi="Trebuchet MS"/>
-                <w:sz w:val="19"/>
-              </w:rPr>
               <w:t xml:space="preserve">−0.14</w:t>
             </w:r>
           </w:p>
@@ -1372,72 +1210,48 @@
       </w:tr>
       <w:tr>
         <w:tc>
-          <w:tcPr>
-            <w:shd w:val="clear" w:color="auto" w:fill="F1F5F4"/>
-          </w:tcPr>
-          <w:p>
-            <w:pPr>
-              <w:pStyle w:val="Compact"/>
-            </w:pPr>
-            <w:r>
-              <w:rPr>
-                <w:rFonts w:ascii="Trebuchet MS" w:hAnsi="Trebuchet MS"/>
-                <w:sz w:val="19"/>
-              </w:rPr>
+          <w:tcPr/>
+          <w:p>
+            <w:pPr>
+              <w:pStyle w:val="Compact"/>
+            </w:pPr>
+            <w:r>
               <w:t xml:space="preserve">ETS additive seasonal (sp = 7), no trend</w:t>
             </w:r>
           </w:p>
         </w:tc>
         <w:tc>
-          <w:tcPr>
-            <w:shd w:val="clear" w:color="auto" w:fill="F1F5F4"/>
-          </w:tcPr>
-          <w:p>
-            <w:pPr>
-              <w:pStyle w:val="Compact"/>
-              <w:jc w:val="right"/>
-            </w:pPr>
-            <w:r>
-              <w:rPr>
-                <w:rFonts w:ascii="Trebuchet MS" w:hAnsi="Trebuchet MS"/>
-                <w:sz w:val="19"/>
-              </w:rPr>
+          <w:tcPr/>
+          <w:p>
+            <w:pPr>
+              <w:pStyle w:val="Compact"/>
+              <w:jc w:val="right"/>
+            </w:pPr>
+            <w:r>
               <w:t xml:space="preserve">9.83</w:t>
             </w:r>
           </w:p>
         </w:tc>
         <w:tc>
-          <w:tcPr>
-            <w:shd w:val="clear" w:color="auto" w:fill="F1F5F4"/>
-          </w:tcPr>
-          <w:p>
-            <w:pPr>
-              <w:pStyle w:val="Compact"/>
-              <w:jc w:val="right"/>
-            </w:pPr>
-            <w:r>
-              <w:rPr>
-                <w:rFonts w:ascii="Trebuchet MS" w:hAnsi="Trebuchet MS"/>
-                <w:sz w:val="19"/>
-              </w:rPr>
+          <w:tcPr/>
+          <w:p>
+            <w:pPr>
+              <w:pStyle w:val="Compact"/>
+              <w:jc w:val="right"/>
+            </w:pPr>
+            <w:r>
               <w:t xml:space="preserve">12.05</w:t>
             </w:r>
           </w:p>
         </w:tc>
         <w:tc>
-          <w:tcPr>
-            <w:shd w:val="clear" w:color="auto" w:fill="F1F5F4"/>
-          </w:tcPr>
-          <w:p>
-            <w:pPr>
-              <w:pStyle w:val="Compact"/>
-              <w:jc w:val="right"/>
-            </w:pPr>
-            <w:r>
-              <w:rPr>
-                <w:rFonts w:ascii="Trebuchet MS" w:hAnsi="Trebuchet MS"/>
-                <w:sz w:val="19"/>
-              </w:rPr>
+          <w:tcPr/>
+          <w:p>
+            <w:pPr>
+              <w:pStyle w:val="Compact"/>
+              <w:jc w:val="right"/>
+            </w:pPr>
+            <w:r>
               <w:t xml:space="preserve">−0.10</w:t>
             </w:r>
           </w:p>
@@ -1451,10 +1265,6 @@
               <w:pStyle w:val="Compact"/>
             </w:pPr>
             <w:r>
-              <w:rPr>
-                <w:rFonts w:ascii="Trebuchet MS" w:hAnsi="Trebuchet MS"/>
-                <w:sz w:val="19"/>
-              </w:rPr>
               <w:t xml:space="preserve">ETS additive trend + additive seasonal</w:t>
             </w:r>
           </w:p>
@@ -1467,10 +1277,6 @@
               <w:jc w:val="right"/>
             </w:pPr>
             <w:r>
-              <w:rPr>
-                <w:rFonts w:ascii="Trebuchet MS" w:hAnsi="Trebuchet MS"/>
-                <w:sz w:val="19"/>
-              </w:rPr>
               <w:t xml:space="preserve">9.79</w:t>
             </w:r>
           </w:p>
@@ -1483,10 +1289,6 @@
               <w:jc w:val="right"/>
             </w:pPr>
             <w:r>
-              <w:rPr>
-                <w:rFonts w:ascii="Trebuchet MS" w:hAnsi="Trebuchet MS"/>
-                <w:sz w:val="19"/>
-              </w:rPr>
               <w:t xml:space="preserve">12.03</w:t>
             </w:r>
           </w:p>
@@ -1499,10 +1301,6 @@
               <w:jc w:val="right"/>
             </w:pPr>
             <w:r>
-              <w:rPr>
-                <w:rFonts w:ascii="Trebuchet MS" w:hAnsi="Trebuchet MS"/>
-                <w:sz w:val="19"/>
-              </w:rPr>
               <w:t xml:space="preserve">−0.07</w:t>
             </w:r>
           </w:p>
@@ -1540,7 +1338,6 @@
     <w:p>
       <w:pPr>
         <w:pStyle w:val="CaptionedFigure"/>
-        <w:jc w:val="center"/>
       </w:pPr>
       <w:r>
         <w:drawing>
@@ -1588,7 +1385,6 @@
     <w:p>
       <w:pPr>
         <w:pStyle w:val="ImageCaption"/>
-        <w:jc w:val="center"/>
       </w:pPr>
       <w:r>
         <w:t xml:space="preserve">Figure 6. Rolling two-day forecasts vs actual, final 30 validation origins</w:t>
@@ -1618,12 +1414,12 @@
         <w:tblW w:type="auto" w:w="0"/>
         <w:tblLook w:firstRow="1" w:lastRow="0" w:firstColumn="0" w:lastColumn="0" w:noHBand="0" w:noVBand="0" w:val="0020"/>
         <w:tblBorders>
-          <w:top w:val="single" w:sz="12" w:color="0D9488"/>
-          <w:bottom w:val="single" w:sz="12" w:color="0D9488"/>
-          <w:insideH w:val="dotted" w:sz="4" w:color="94A3B8"/>
-          <w:left w:val="nil" w:sz="0" w:color="auto"/>
-          <w:right w:val="nil" w:sz="0" w:color="auto"/>
-          <w:insideV w:val="nil" w:sz="0" w:color="auto"/>
+          <w:top w:val="single" w:sz="4" w:color="999999"/>
+          <w:left w:val="single" w:sz="4" w:color="999999"/>
+          <w:bottom w:val="single" w:sz="4" w:color="999999"/>
+          <w:right w:val="single" w:sz="4" w:color="999999"/>
+          <w:insideH w:val="single" w:sz="4" w:color="999999"/>
+          <w:insideV w:val="single" w:sz="4" w:color="999999"/>
         </w:tblBorders>
       </w:tblPr>
       <w:tblGrid>
@@ -1637,28 +1433,21 @@
           <w:tblHeader w:val="on"/>
         </w:trPr>
         <w:tc>
-          <w:tcPr>
-            <w:shd w:val="clear" w:color="auto" w:fill="0D9488"/>
-          </w:tcPr>
+          <w:tcPr/>
           <w:p>
             <w:pPr>
               <w:pStyle w:val="Compact"/>
             </w:pPr>
             <w:r>
               <w:rPr>
-                <w:rFonts w:ascii="Trebuchet MS" w:hAnsi="Trebuchet MS"/>
                 <w:b/>
-                <w:color w:val="FFFFFF"/>
-                <w:sz w:val="19"/>
               </w:rPr>
               <w:t xml:space="preserve">MA7</w:t>
             </w:r>
           </w:p>
         </w:tc>
         <w:tc>
-          <w:tcPr>
-            <w:shd w:val="clear" w:color="auto" w:fill="0D9488"/>
-          </w:tcPr>
+          <w:tcPr/>
           <w:p>
             <w:pPr>
               <w:pStyle w:val="Compact"/>
@@ -1666,19 +1455,14 @@
             </w:pPr>
             <w:r>
               <w:rPr>
-                <w:rFonts w:ascii="Trebuchet MS" w:hAnsi="Trebuchet MS"/>
                 <w:b/>
-                <w:color w:val="FFFFFF"/>
-                <w:sz w:val="19"/>
               </w:rPr>
               <w:t xml:space="preserve">MAE</w:t>
             </w:r>
           </w:p>
         </w:tc>
         <w:tc>
-          <w:tcPr>
-            <w:shd w:val="clear" w:color="auto" w:fill="0D9488"/>
-          </w:tcPr>
+          <w:tcPr/>
           <w:p>
             <w:pPr>
               <w:pStyle w:val="Compact"/>
@@ -1686,19 +1470,14 @@
             </w:pPr>
             <w:r>
               <w:rPr>
-                <w:rFonts w:ascii="Trebuchet MS" w:hAnsi="Trebuchet MS"/>
                 <w:b/>
-                <w:color w:val="FFFFFF"/>
-                <w:sz w:val="19"/>
               </w:rPr>
               <w:t xml:space="preserve">RMSE</w:t>
             </w:r>
           </w:p>
         </w:tc>
         <w:tc>
-          <w:tcPr>
-            <w:shd w:val="clear" w:color="auto" w:fill="0D9488"/>
-          </w:tcPr>
+          <w:tcPr/>
           <w:p>
             <w:pPr>
               <w:pStyle w:val="Compact"/>
@@ -1706,10 +1485,7 @@
             </w:pPr>
             <w:r>
               <w:rPr>
-                <w:rFonts w:ascii="Trebuchet MS" w:hAnsi="Trebuchet MS"/>
                 <w:b/>
-                <w:color w:val="FFFFFF"/>
-                <w:sz w:val="19"/>
               </w:rPr>
               <w:t xml:space="preserve">Mean error</w:t>
             </w:r>
@@ -1724,10 +1500,6 @@
               <w:pStyle w:val="Compact"/>
             </w:pPr>
             <w:r>
-              <w:rPr>
-                <w:rFonts w:ascii="Trebuchet MS" w:hAnsi="Trebuchet MS"/>
-                <w:sz w:val="19"/>
-              </w:rPr>
               <w:t xml:space="preserve">Validation</w:t>
             </w:r>
           </w:p>
@@ -1740,10 +1512,6 @@
               <w:jc w:val="right"/>
             </w:pPr>
             <w:r>
-              <w:rPr>
-                <w:rFonts w:ascii="Trebuchet MS" w:hAnsi="Trebuchet MS"/>
-                <w:sz w:val="19"/>
-              </w:rPr>
               <w:t xml:space="preserve">4.92</w:t>
             </w:r>
           </w:p>
@@ -1756,10 +1524,6 @@
               <w:jc w:val="right"/>
             </w:pPr>
             <w:r>
-              <w:rPr>
-                <w:rFonts w:ascii="Trebuchet MS" w:hAnsi="Trebuchet MS"/>
-                <w:sz w:val="19"/>
-              </w:rPr>
               <w:t xml:space="preserve">6.57</w:t>
             </w:r>
           </w:p>
@@ -1772,10 +1536,6 @@
               <w:jc w:val="right"/>
             </w:pPr>
             <w:r>
-              <w:rPr>
-                <w:rFonts w:ascii="Trebuchet MS" w:hAnsi="Trebuchet MS"/>
-                <w:sz w:val="19"/>
-              </w:rPr>
               <w:t xml:space="preserve">−0.14</w:t>
             </w:r>
           </w:p>
@@ -1783,72 +1543,48 @@
       </w:tr>
       <w:tr>
         <w:tc>
-          <w:tcPr>
-            <w:shd w:val="clear" w:color="auto" w:fill="F1F5F4"/>
-          </w:tcPr>
-          <w:p>
-            <w:pPr>
-              <w:pStyle w:val="Compact"/>
-            </w:pPr>
-            <w:r>
-              <w:rPr>
-                <w:rFonts w:ascii="Trebuchet MS" w:hAnsi="Trebuchet MS"/>
-                <w:sz w:val="19"/>
-              </w:rPr>
+          <w:tcPr/>
+          <w:p>
+            <w:pPr>
+              <w:pStyle w:val="Compact"/>
+            </w:pPr>
+            <w:r>
               <w:t xml:space="preserve">Test</w:t>
             </w:r>
           </w:p>
         </w:tc>
         <w:tc>
-          <w:tcPr>
-            <w:shd w:val="clear" w:color="auto" w:fill="F1F5F4"/>
-          </w:tcPr>
-          <w:p>
-            <w:pPr>
-              <w:pStyle w:val="Compact"/>
-              <w:jc w:val="right"/>
-            </w:pPr>
-            <w:r>
-              <w:rPr>
-                <w:rFonts w:ascii="Trebuchet MS" w:hAnsi="Trebuchet MS"/>
-                <w:sz w:val="19"/>
-              </w:rPr>
+          <w:tcPr/>
+          <w:p>
+            <w:pPr>
+              <w:pStyle w:val="Compact"/>
+              <w:jc w:val="right"/>
+            </w:pPr>
+            <w:r>
               <w:t xml:space="preserve">4.85</w:t>
             </w:r>
           </w:p>
         </w:tc>
         <w:tc>
-          <w:tcPr>
-            <w:shd w:val="clear" w:color="auto" w:fill="F1F5F4"/>
-          </w:tcPr>
-          <w:p>
-            <w:pPr>
-              <w:pStyle w:val="Compact"/>
-              <w:jc w:val="right"/>
-            </w:pPr>
-            <w:r>
-              <w:rPr>
-                <w:rFonts w:ascii="Trebuchet MS" w:hAnsi="Trebuchet MS"/>
-                <w:sz w:val="19"/>
-              </w:rPr>
+          <w:tcPr/>
+          <w:p>
+            <w:pPr>
+              <w:pStyle w:val="Compact"/>
+              <w:jc w:val="right"/>
+            </w:pPr>
+            <w:r>
               <w:t xml:space="preserve">6.14</w:t>
             </w:r>
           </w:p>
         </w:tc>
         <w:tc>
-          <w:tcPr>
-            <w:shd w:val="clear" w:color="auto" w:fill="F1F5F4"/>
-          </w:tcPr>
-          <w:p>
-            <w:pPr>
-              <w:pStyle w:val="Compact"/>
-              <w:jc w:val="right"/>
-            </w:pPr>
-            <w:r>
-              <w:rPr>
-                <w:rFonts w:ascii="Trebuchet MS" w:hAnsi="Trebuchet MS"/>
-                <w:sz w:val="19"/>
-              </w:rPr>
+          <w:tcPr/>
+          <w:p>
+            <w:pPr>
+              <w:pStyle w:val="Compact"/>
+              <w:jc w:val="right"/>
+            </w:pPr>
+            <w:r>
               <w:t xml:space="preserve">−0.12</w:t>
             </w:r>
           </w:p>
@@ -1866,7 +1602,6 @@
     <w:p>
       <w:pPr>
         <w:pStyle w:val="CaptionedFigure"/>
-        <w:jc w:val="center"/>
       </w:pPr>
       <w:r>
         <w:drawing>
@@ -1914,7 +1649,6 @@
     <w:p>
       <w:pPr>
         <w:pStyle w:val="ImageCaption"/>
-        <w:jc w:val="center"/>
       </w:pPr>
       <w:r>
         <w:t xml:space="preserve">Figure 7. MA7 rolling two-day forecasts on the test block</w:t>
@@ -1925,9 +1659,6 @@
     <w:p>
       <w:pPr>
         <w:pStyle w:val="Heading2"/>
-        <w:pBdr>
-          <w:bottom w:val="single" w:sz="8" w:space="2" w:color="7C3AED"/>
-        </w:pBdr>
       </w:pPr>
       <w:r>
         <w:t xml:space="preserve">Question 3 — Continuous review (Q, R)</w:t>
@@ -2216,7 +1947,6 @@
     <w:p>
       <w:pPr>
         <w:pStyle w:val="CaptionedFigure"/>
-        <w:jc w:val="center"/>
       </w:pPr>
       <w:r>
         <w:drawing>
@@ -2264,7 +1994,6 @@
     <w:p>
       <w:pPr>
         <w:pStyle w:val="ImageCaption"/>
-        <w:jc w:val="center"/>
       </w:pPr>
       <w:r>
         <w:t xml:space="preserve">Figure 8. Forecast-based reorder point by test day vs fixed Normal R</w:t>
@@ -2276,7 +2005,6 @@
       <w:footnotePr>
         <w:numRestart w:val="eachSect"/>
       </w:footnotePr>
-      <w:pgMar w:left="1296" w:right="1296" w:top="1152" w:bottom="1152"/>
     </w:sectPr>
   </w:body>
 </w:document>
@@ -2410,11 +2138,6 @@
   <w:style w:default="1" w:styleId="Normal" w:type="paragraph">
     <w:name w:val="Normal"/>
     <w:qFormat/>
-    <w:rPr>
-      <w:rFonts w:ascii="Georgia" w:hAnsi="Georgia" w:cs="Georgia" w:eastAsia="Georgia"/>
-      <w:color w:val="334155"/>
-      <w:sz w:val="21"/>
-    </w:rPr>
   </w:style>
   <w:style w:styleId="BodyText" w:type="paragraph">
     <w:name w:val="Body Text"/>
@@ -2424,22 +2147,12 @@
     <w:pPr>
       <w:spacing w:after="180" w:before="180"/>
     </w:pPr>
-    <w:rPr>
-      <w:rFonts w:ascii="Georgia" w:hAnsi="Georgia" w:cs="Georgia" w:eastAsia="Georgia"/>
-      <w:color w:val="334155"/>
-      <w:sz w:val="21"/>
-    </w:rPr>
   </w:style>
   <w:style w:customStyle="1" w:styleId="FirstParagraph" w:type="paragraph">
     <w:name w:val="First Paragraph"/>
     <w:basedOn w:val="BodyText"/>
     <w:next w:val="BodyText"/>
     <w:qFormat/>
-    <w:rPr>
-      <w:rFonts w:ascii="Georgia" w:hAnsi="Georgia" w:cs="Georgia" w:eastAsia="Georgia"/>
-      <w:color w:val="334155"/>
-      <w:sz w:val="21"/>
-    </w:rPr>
   </w:style>
   <w:style w:customStyle="1" w:styleId="Compact" w:type="paragraph">
     <w:name w:val="Compact"/>
@@ -2448,11 +2161,6 @@
     <w:pPr>
       <w:spacing w:after="36" w:before="36"/>
     </w:pPr>
-    <w:rPr>
-      <w:rFonts w:ascii="Georgia" w:hAnsi="Georgia" w:cs="Georgia" w:eastAsia="Georgia"/>
-      <w:color w:val="334155"/>
-      <w:sz w:val="21"/>
-    </w:rPr>
   </w:style>
   <w:style w:styleId="Title" w:type="paragraph">
     <w:name w:val="Title"/>
@@ -2602,9 +2310,8 @@
       <w:outlineLvl w:val="0"/>
     </w:pPr>
     <w:rPr>
-      <w:rFonts w:ascii="Trebuchet MS" w:hAnsi="Trebuchet MS" w:cs="Trebuchet MS" w:eastAsia="Trebuchet MS"/>
-      <w:b/>
-      <w:color w:val="0D9488"/>
+      <w:rFonts w:asciiTheme="majorHAnsi" w:cstheme="majorBidi" w:eastAsiaTheme="majorEastAsia" w:hAnsiTheme="majorHAnsi"/>
+      <w:color w:themeColor="accent1" w:themeShade="BF" w:val="0F4761"/>
       <w:sz w:val="40"/>
       <w:szCs w:val="40"/>
     </w:rPr>
@@ -2626,10 +2333,9 @@
       <w:outlineLvl w:val="1"/>
     </w:pPr>
     <w:rPr>
-      <w:rFonts w:ascii="Trebuchet MS" w:hAnsi="Trebuchet MS" w:cs="Trebuchet MS" w:eastAsia="Trebuchet MS"/>
-      <w:b/>
-      <w:color w:val="7C3AED"/>
-      <w:sz w:val="28"/>
+      <w:rFonts w:asciiTheme="majorHAnsi" w:cstheme="majorBidi" w:eastAsiaTheme="majorEastAsia" w:hAnsiTheme="majorHAnsi"/>
+      <w:color w:themeColor="accent1" w:themeShade="BF" w:val="0F4761"/>
+      <w:sz w:val="32"/>
       <w:szCs w:val="32"/>
     </w:rPr>
   </w:style>
@@ -3006,13 +2712,6 @@
   <w:style w:customStyle="1" w:styleId="ImageCaption" w:type="paragraph">
     <w:name w:val="Image Caption"/>
     <w:basedOn w:val="Caption"/>
-    <w:rPr>
-      <w:rFonts w:ascii="Georgia" w:hAnsi="Georgia" w:cs="Georgia" w:eastAsia="Georgia"/>
-      <w:b w:val="0"/>
-      <w:i/>
-      <w:color w:val="C2410C"/>
-      <w:sz w:val="18"/>
-    </w:rPr>
   </w:style>
   <w:style w:customStyle="1" w:styleId="Figure" w:type="paragraph">
     <w:name w:val="Figure"/>

</xml_diff>

<commit_message>
Rewrite plot cells in plain matplotlib style with default fonts and colours
Co-Authored-By: Claude Opus 5.5 <noreply@anthropic.com>
Claude-Session: https://claude.ai/code/session_015xCXyYN8m36HffbEQaovsv
</commit_message>
<xml_diff>
--- a/hw2/HW2_Report.docx
+++ b/hw2/HW2_Report.docx
@@ -194,7 +194,7 @@
       <w:r>
         <w:drawing>
           <wp:inline>
-            <wp:extent cx="3291840" cy="3285822"/>
+            <wp:extent cx="3291840" cy="3325660"/>
             <wp:effectExtent b="0" l="0" r="0" t="0"/>
             <wp:docPr descr="Figure 1. Actual occupancy vs booked time, with 45° line" title="" id="10" name="Picture"/>
             <a:graphic>
@@ -215,7 +215,7 @@
                   <pic:spPr bwMode="auto">
                     <a:xfrm>
                       <a:off x="0" y="0"/>
-                      <a:ext cx="3291840" cy="3285822"/>
+                      <a:ext cx="3291840" cy="3325660"/>
                     </a:xfrm>
                     <a:prstGeom prst="rect">
                       <a:avLst/>
@@ -748,7 +748,7 @@
       <w:r>
         <w:drawing>
           <wp:inline>
-            <wp:extent cx="4389120" cy="1695689"/>
+            <wp:extent cx="4389120" cy="1726058"/>
             <wp:effectExtent b="0" l="0" r="0" t="0"/>
             <wp:docPr descr="Figure 2. Test mismatch cost by booking policy" title="" id="13" name="Picture"/>
             <a:graphic>
@@ -769,7 +769,7 @@
                   <pic:spPr bwMode="auto">
                     <a:xfrm>
                       <a:off x="0" y="0"/>
-                      <a:ext cx="4389120" cy="1695689"/>
+                      <a:ext cx="4389120" cy="1726058"/>
                     </a:xfrm>
                     <a:prstGeom prst="rect">
                       <a:avLst/>
@@ -803,7 +803,7 @@
       <w:r>
         <w:drawing>
           <wp:inline>
-            <wp:extent cx="4389120" cy="2211484"/>
+            <wp:extent cx="4389120" cy="1923322"/>
             <wp:effectExtent b="0" l="0" r="0" t="0"/>
             <wp:docPr descr="Figure 3. Training residuals vs Normal approximation" title="" id="16" name="Picture"/>
             <a:graphic>
@@ -824,7 +824,7 @@
                   <pic:spPr bwMode="auto">
                     <a:xfrm>
                       <a:off x="0" y="0"/>
-                      <a:ext cx="4389120" cy="2211484"/>
+                      <a:ext cx="4389120" cy="1923322"/>
                     </a:xfrm>
                     <a:prstGeom prst="rect">
                       <a:avLst/>
@@ -941,7 +941,7 @@
       <w:r>
         <w:drawing>
           <wp:inline>
-            <wp:extent cx="5334000" cy="1972413"/>
+            <wp:extent cx="5334000" cy="1748117"/>
             <wp:effectExtent b="0" l="0" r="0" t="0"/>
             <wp:docPr descr="Figure 4. Daily sales with training / validation / test blocks" title="" id="20" name="Picture"/>
             <a:graphic>
@@ -962,7 +962,7 @@
                   <pic:spPr bwMode="auto">
                     <a:xfrm>
                       <a:off x="0" y="0"/>
-                      <a:ext cx="5334000" cy="1972413"/>
+                      <a:ext cx="5334000" cy="1748117"/>
                     </a:xfrm>
                     <a:prstGeom prst="rect">
                       <a:avLst/>
@@ -996,7 +996,7 @@
       <w:r>
         <w:drawing>
           <wp:inline>
-            <wp:extent cx="4389120" cy="2173545"/>
+            <wp:extent cx="4389120" cy="1944546"/>
             <wp:effectExtent b="0" l="0" r="0" t="0"/>
             <wp:docPr descr="Figure 5. Mean daily sales by weekday" title="" id="23" name="Picture"/>
             <a:graphic>
@@ -1017,7 +1017,7 @@
                   <pic:spPr bwMode="auto">
                     <a:xfrm>
                       <a:off x="0" y="0"/>
-                      <a:ext cx="4389120" cy="2173545"/>
+                      <a:ext cx="4389120" cy="1944546"/>
                     </a:xfrm>
                     <a:prstGeom prst="rect">
                       <a:avLst/>
@@ -1342,7 +1342,7 @@
       <w:r>
         <w:drawing>
           <wp:inline>
-            <wp:extent cx="5334000" cy="2102724"/>
+            <wp:extent cx="5334000" cy="1755493"/>
             <wp:effectExtent b="0" l="0" r="0" t="0"/>
             <wp:docPr descr="Figure 6. Rolling two-day forecasts vs actual, final 30 validation origins" title="" id="26" name="Picture"/>
             <a:graphic>
@@ -1363,7 +1363,7 @@
                   <pic:spPr bwMode="auto">
                     <a:xfrm>
                       <a:off x="0" y="0"/>
-                      <a:ext cx="5334000" cy="2102724"/>
+                      <a:ext cx="5334000" cy="1755493"/>
                     </a:xfrm>
                     <a:prstGeom prst="rect">
                       <a:avLst/>
@@ -1606,7 +1606,7 @@
       <w:r>
         <w:drawing>
           <wp:inline>
-            <wp:extent cx="5334000" cy="1986234"/>
+            <wp:extent cx="5334000" cy="1752535"/>
             <wp:effectExtent b="0" l="0" r="0" t="0"/>
             <wp:docPr descr="Figure 7. MA7 rolling two-day forecasts on the test block" title="" id="29" name="Picture"/>
             <a:graphic>
@@ -1627,7 +1627,7 @@
                   <pic:spPr bwMode="auto">
                     <a:xfrm>
                       <a:off x="0" y="0"/>
-                      <a:ext cx="5334000" cy="1986234"/>
+                      <a:ext cx="5334000" cy="1752535"/>
                     </a:xfrm>
                     <a:prstGeom prst="rect">
                       <a:avLst/>
@@ -1951,7 +1951,7 @@
       <w:r>
         <w:drawing>
           <wp:inline>
-            <wp:extent cx="5334000" cy="1990218"/>
+            <wp:extent cx="5334000" cy="1748117"/>
             <wp:effectExtent b="0" l="0" r="0" t="0"/>
             <wp:docPr descr="Figure 8. Forecast-based reorder point by test day vs fixed Normal R" title="" id="33" name="Picture"/>
             <a:graphic>
@@ -1972,7 +1972,7 @@
                   <pic:spPr bwMode="auto">
                     <a:xfrm>
                       <a:off x="0" y="0"/>
-                      <a:ext cx="5334000" cy="1990218"/>
+                      <a:ext cx="5334000" cy="1748117"/>
                     </a:xfrm>
                     <a:prstGeom prst="rect">
                       <a:avLst/>

</xml_diff>